<commit_message>
Modificación de portada: Añadir nombres y titulo del entrgable
</commit_message>
<xml_diff>
--- a/GRUPO 5 RBD Entrega Parcial 2627.docx
+++ b/GRUPO 5 RBD Entrega Parcial 2627.docx
@@ -1,6 +1,6 @@
 
 <file path=word/document.xml><?xml version="1.0" encoding="utf-8"?>
-<w:document xmlns:wpc="http://schemas.microsoft.com/office/word/2010/wordprocessingCanvas" xmlns:cx="http://schemas.microsoft.com/office/drawing/2014/chartex" xmlns:cx1="http://schemas.microsoft.com/office/drawing/2015/9/8/chartex" xmlns:cx2="http://schemas.microsoft.com/office/drawing/2015/10/21/chartex" xmlns:cx3="http://schemas.microsoft.com/office/drawing/2016/5/9/chartex" xmlns:cx4="http://schemas.microsoft.com/office/drawing/2016/5/10/chartex" xmlns:cx5="http://schemas.microsoft.com/office/drawing/2016/5/11/chartex" xmlns:cx6="http://schemas.microsoft.com/office/drawing/2016/5/12/chartex" xmlns:cx7="http://schemas.microsoft.com/office/drawing/2016/5/13/chartex" xmlns:cx8="http://schemas.microsoft.com/office/drawing/2016/5/14/chartex" xmlns:mc="http://schemas.openxmlformats.org/markup-compatibility/2006" xmlns:aink="http://schemas.microsoft.com/office/drawing/2016/ink" xmlns:am3d="http://schemas.microsoft.com/office/drawing/2017/model3d" xmlns:o="urn:schemas-microsoft-com:office:office" xmlns:oel="http://schemas.microsoft.com/office/2019/extlst" xmlns:r="http://schemas.openxmlformats.org/officeDocument/2006/relationships" xmlns:m="http://schemas.openxmlformats.org/officeDocument/2006/math" xmlns:v="urn:schemas-microsoft-com:vml" xmlns:wp14="http://schemas.microsoft.com/office/word/2010/wordprocessingDrawing" xmlns:wp="http://schemas.openxmlformats.org/drawingml/2006/wordprocessingDrawing" xmlns:w10="urn:schemas-microsoft-com:office:word" xmlns:w="http://schemas.openxmlformats.org/wordprocessingml/2006/main" xmlns:w14="http://schemas.microsoft.com/office/word/2010/wordml" xmlns:w15="http://schemas.microsoft.com/office/word/2012/wordml" xmlns:w16cex="http://schemas.microsoft.com/office/word/2018/wordml/cex" xmlns:w16cid="http://schemas.microsoft.com/office/word/2016/wordml/cid" xmlns:w16="http://schemas.microsoft.com/office/word/2018/wordml" xmlns:w16sdtdh="http://schemas.microsoft.com/office/word/2020/wordml/sdtdatahash" xmlns:w16se="http://schemas.microsoft.com/office/word/2015/wordml/symex" xmlns:wpg="http://schemas.microsoft.com/office/word/2010/wordprocessingGroup" xmlns:wpi="http://schemas.microsoft.com/office/word/2010/wordprocessingInk" xmlns:wne="http://schemas.microsoft.com/office/word/2006/wordml" xmlns:wps="http://schemas.microsoft.com/office/word/2010/wordprocessingShape" mc:Ignorable="w14 w15 w16se w16cid w16 w16cex w16sdtdh wp14">
+<w:document xmlns:wpc="http://schemas.microsoft.com/office/word/2010/wordprocessingCanvas" xmlns:cx="http://schemas.microsoft.com/office/drawing/2014/chartex" xmlns:cx1="http://schemas.microsoft.com/office/drawing/2015/9/8/chartex" xmlns:cx2="http://schemas.microsoft.com/office/drawing/2015/10/21/chartex" xmlns:cx3="http://schemas.microsoft.com/office/drawing/2016/5/9/chartex" xmlns:cx4="http://schemas.microsoft.com/office/drawing/2016/5/10/chartex" xmlns:cx5="http://schemas.microsoft.com/office/drawing/2016/5/11/chartex" xmlns:cx6="http://schemas.microsoft.com/office/drawing/2016/5/12/chartex" xmlns:cx7="http://schemas.microsoft.com/office/drawing/2016/5/13/chartex" xmlns:cx8="http://schemas.microsoft.com/office/drawing/2016/5/14/chartex" xmlns:mc="http://schemas.openxmlformats.org/markup-compatibility/2006" xmlns:aink="http://schemas.microsoft.com/office/drawing/2016/ink" xmlns:am3d="http://schemas.microsoft.com/office/drawing/2017/model3d" xmlns:o="urn:schemas-microsoft-com:office:office" xmlns:oel="http://schemas.microsoft.com/office/2019/extlst" xmlns:r="http://schemas.openxmlformats.org/officeDocument/2006/relationships" xmlns:m="http://schemas.openxmlformats.org/officeDocument/2006/math" xmlns:v="urn:schemas-microsoft-com:vml" xmlns:wp14="http://schemas.microsoft.com/office/word/2010/wordprocessingDrawing" xmlns:wp="http://schemas.openxmlformats.org/drawingml/2006/wordprocessingDrawing" xmlns:w10="urn:schemas-microsoft-com:office:word" xmlns:w="http://schemas.openxmlformats.org/wordprocessingml/2006/main" xmlns:w14="http://schemas.microsoft.com/office/word/2010/wordml" xmlns:w15="http://schemas.microsoft.com/office/word/2012/wordml" xmlns:w16cex="http://schemas.microsoft.com/office/word/2018/wordml/cex" xmlns:w16cid="http://schemas.microsoft.com/office/word/2016/wordml/cid" xmlns:w16="http://schemas.microsoft.com/office/word/2018/wordml" xmlns:w16du="http://schemas.microsoft.com/office/word/2023/wordml/word16du" xmlns:w16sdtdh="http://schemas.microsoft.com/office/word/2020/wordml/sdtdatahash" xmlns:w16sdtfl="http://schemas.microsoft.com/office/word/2024/wordml/sdtformatlock" xmlns:w16se="http://schemas.microsoft.com/office/word/2015/wordml/symex" xmlns:wpg="http://schemas.microsoft.com/office/word/2010/wordprocessingGroup" xmlns:wpi="http://schemas.microsoft.com/office/word/2010/wordprocessingInk" xmlns:wne="http://schemas.microsoft.com/office/word/2006/wordml" xmlns:wps="http://schemas.microsoft.com/office/word/2010/wordprocessingShape" mc:Ignorable="w14 w15 w16se w16cid w16 w16cex w16sdtdh w16sdtfl w16du wp14">
   <w:body>
     <w:p>
       <w:pPr>
@@ -94,14 +94,14 @@
                                 <w:rFonts w:ascii="Roboto" w:hAnsi="Roboto"/>
                                 <w:color w:val="FFFFFF"/>
                               </w:rPr>
-                              <w:t>Nombre del alumno</w:t>
+                              <w:t>Javier Rueda Jimene</w:t>
                             </w:r>
                             <w:r>
                               <w:rPr>
                                 <w:rFonts w:ascii="Roboto" w:hAnsi="Roboto"/>
                                 <w:color w:val="FFFFFF"/>
                               </w:rPr>
-                              <w:t>/a</w:t>
+                              <w:t>z</w:t>
                             </w:r>
                           </w:p>
                           <w:p>
@@ -119,7 +119,7 @@
                                 <w:rFonts w:ascii="Roboto" w:hAnsi="Roboto"/>
                                 <w:color w:val="FFFFFF"/>
                               </w:rPr>
-                              <w:t>Nombre del alumno/a</w:t>
+                              <w:t>Fernando Arroyo Almodóvar</w:t>
                             </w:r>
                           </w:p>
                           <w:p>
@@ -137,7 +137,7 @@
                                 <w:rFonts w:ascii="Roboto" w:hAnsi="Roboto"/>
                                 <w:color w:val="FFFFFF"/>
                               </w:rPr>
-                              <w:t>Nombre del alumno/a</w:t>
+                              <w:t>Ricardo Corral Valderas</w:t>
                             </w:r>
                           </w:p>
                           <w:p>
@@ -155,7 +155,7 @@
                                 <w:rFonts w:ascii="Roboto" w:hAnsi="Roboto"/>
                                 <w:color w:val="FFFFFF"/>
                               </w:rPr>
-                              <w:t>Practica entregable (Enunciado y entregable)</w:t>
+                              <w:t>GRUPO 5: RETO BIG DATA - MIDTERM</w:t>
                             </w:r>
                           </w:p>
                         </w:txbxContent>
@@ -175,9 +175,9 @@
               </wp:anchor>
             </w:drawing>
           </mc:Choice>
-          <mc:Fallback xmlns:a="http://schemas.openxmlformats.org/drawingml/2006/main" xmlns:a14="http://schemas.microsoft.com/office/drawing/2010/main" xmlns:pic="http://schemas.openxmlformats.org/drawingml/2006/picture">
-            <w:pict xmlns:w="http://schemas.openxmlformats.org/wordprocessingml/2006/main">
-              <v:rect xmlns:w14="http://schemas.microsoft.com/office/word/2010/wordml" xmlns:o="urn:schemas-microsoft-com:office:office" xmlns:v="urn:schemas-microsoft-com:vml" id="Rectángulo 195" style="position:absolute;margin-left:-46.95pt;margin-top:257.1pt;width:524.3pt;height:421.85pt;z-index:251656192;visibility:visible;mso-wrap-style:square;mso-width-percent:0;mso-height-percent:0;mso-wrap-distance-left:9pt;mso-wrap-distance-top:0;mso-wrap-distance-right:9pt;mso-wrap-distance-bottom:0;mso-position-horizontal:absolute;mso-position-horizontal-relative:text;mso-position-vertical:absolute;mso-position-vertical-relative:text;mso-width-percent:0;mso-height-percent:0;mso-width-relative:page;mso-height-relative:page;v-text-anchor:bottom" o:spid="_x0000_s1026" fillcolor="#04339f" stroked="f" strokeweight="1pt" w14:anchorId="2705B97E" o:gfxdata="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">
+          <mc:Fallback>
+            <w:pict>
+              <v:rect w14:anchorId="2705B97E" id="Rectángulo 195" o:spid="_x0000_s1026" style="position:absolute;margin-left:-46.95pt;margin-top:257.1pt;width:524.3pt;height:421.85pt;z-index:251656192;visibility:visible;mso-wrap-style:square;mso-width-percent:0;mso-height-percent:0;mso-wrap-distance-left:9pt;mso-wrap-distance-top:0;mso-wrap-distance-right:9pt;mso-wrap-distance-bottom:0;mso-position-horizontal:absolute;mso-position-horizontal-relative:text;mso-position-vertical:absolute;mso-position-vertical-relative:text;mso-width-percent:0;mso-height-percent:0;mso-width-relative:page;mso-height-relative:page;v-text-anchor:bottom" o:gfxdata="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" fillcolor="#04339f" stroked="f" strokeweight="1pt">
                 <v:textbox inset="36pt,57.6pt,36pt,36pt">
                   <w:txbxContent>
                     <w:p>
@@ -195,14 +195,14 @@
                           <w:rFonts w:ascii="Roboto" w:hAnsi="Roboto"/>
                           <w:color w:val="FFFFFF"/>
                         </w:rPr>
-                        <w:t>Nombre del alumno</w:t>
+                        <w:t>Javier Rueda Jimene</w:t>
                       </w:r>
                       <w:r>
                         <w:rPr>
                           <w:rFonts w:ascii="Roboto" w:hAnsi="Roboto"/>
                           <w:color w:val="FFFFFF"/>
                         </w:rPr>
-                        <w:t>/a</w:t>
+                        <w:t>z</w:t>
                       </w:r>
                     </w:p>
                     <w:p>
@@ -220,7 +220,7 @@
                           <w:rFonts w:ascii="Roboto" w:hAnsi="Roboto"/>
                           <w:color w:val="FFFFFF"/>
                         </w:rPr>
-                        <w:t>Nombre del alumno/a</w:t>
+                        <w:t>Fernando Arroyo Almodóvar</w:t>
                       </w:r>
                     </w:p>
                     <w:p>
@@ -238,7 +238,7 @@
                           <w:rFonts w:ascii="Roboto" w:hAnsi="Roboto"/>
                           <w:color w:val="FFFFFF"/>
                         </w:rPr>
-                        <w:t>Nombre del alumno/a</w:t>
+                        <w:t>Ricardo Corral Valderas</w:t>
                       </w:r>
                     </w:p>
                     <w:p>
@@ -256,12 +256,12 @@
                           <w:rFonts w:ascii="Roboto" w:hAnsi="Roboto"/>
                           <w:color w:val="FFFFFF"/>
                         </w:rPr>
-                        <w:t>Practica entregable (Enunciado y entregable)</w:t>
+                        <w:t>GRUPO 5: RETO BIG DATA - MIDTERM</w:t>
                       </w:r>
                     </w:p>
                   </w:txbxContent>
                 </v:textbox>
-                <w10:wrap xmlns:w10="urn:schemas-microsoft-com:office:word" type="tight"/>
+                <w10:wrap type="tight"/>
               </v:rect>
             </w:pict>
           </mc:Fallback>
@@ -490,13 +490,13 @@
               </wp:anchor>
             </w:drawing>
           </mc:Choice>
-          <mc:Fallback xmlns:a="http://schemas.openxmlformats.org/drawingml/2006/main" xmlns:a14="http://schemas.microsoft.com/office/drawing/2010/main" xmlns:pic="http://schemas.openxmlformats.org/drawingml/2006/picture">
+          <mc:Fallback xmlns:pic="http://schemas.openxmlformats.org/drawingml/2006/picture" xmlns:a14="http://schemas.microsoft.com/office/drawing/2010/main" xmlns:a="http://schemas.openxmlformats.org/drawingml/2006/main">
             <w:pict>
               <v:shapetype id="_x0000_t202" coordsize="21600,21600" o:spt="202" path="m,l,21600r21600,l21600,xe" w14:anchorId="05415908">
                 <v:stroke joinstyle="miter"/>
                 <v:path gradientshapeok="t" o:connecttype="rect"/>
               </v:shapetype>
-              <v:shape id="Cuadro de texto 196" style="position:absolute;margin-left:-46.95pt;margin-top:68.1pt;width:524.3pt;height:228.4pt;z-index:251655168;visibility:visible;mso-wrap-style:square;mso-width-percent:0;mso-height-percent:0;mso-wrap-distance-left:9pt;mso-wrap-distance-top:0;mso-wrap-distance-right:9pt;mso-wrap-distance-bottom:0;mso-position-horizontal:absolute;mso-position-horizontal-relative:text;mso-position-vertical:absolute;mso-position-vertical-relative:text;mso-width-percent:0;mso-height-percent:0;mso-width-relative:page;mso-height-relative:page;v-text-anchor:middle" o:spid="_x0000_s1027" stroked="f" strokeweight=".5pt" type="#_x0000_t202" o:gfxdata="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">
+              <v:shape id="Cuadro de texto 196" style="position:absolute;margin-left:-46.95pt;margin-top:68.1pt;width:524.3pt;height:228.4pt;z-index:251655168;visibility:visible;mso-wrap-style:square;mso-width-percent:0;mso-height-percent:0;mso-wrap-distance-left:9pt;mso-wrap-distance-top:0;mso-wrap-distance-right:9pt;mso-wrap-distance-bottom:0;mso-position-horizontal:absolute;mso-position-horizontal-relative:text;mso-position-vertical:absolute;mso-position-vertical-relative:text;mso-width-percent:0;mso-height-percent:0;mso-width-relative:page;mso-height-relative:page;v-text-anchor:middle" o:spid="_x0000_s1027" stroked="f" strokeweight=".5pt" type="#_x0000_t202" o:gfxdata="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">
                 <v:textbox inset="36pt,7.2pt,36pt,7.2pt">
                   <w:txbxContent>
                     <w:p>
@@ -642,7 +642,7 @@
               </wp:anchor>
             </w:drawing>
           </mc:Choice>
-          <mc:Fallback xmlns:mv="urn:schemas-microsoft-com:mac:vml" xmlns:mo="http://schemas.microsoft.com/office/mac/office/2008/main" xmlns:pic="http://schemas.openxmlformats.org/drawingml/2006/picture" xmlns:a14="http://schemas.microsoft.com/office/drawing/2010/main" xmlns:a="http://schemas.openxmlformats.org/drawingml/2006/main">
+          <mc:Fallback xmlns:a="http://schemas.openxmlformats.org/drawingml/2006/main" xmlns:a14="http://schemas.microsoft.com/office/drawing/2010/main" xmlns:pic="http://schemas.openxmlformats.org/drawingml/2006/picture" xmlns:mo="http://schemas.microsoft.com/office/mac/office/2008/main" xmlns:mv="urn:schemas-microsoft-com:mac:vml">
             <w:pict>
               <v:rect id="Rectángulo 194" style="position:absolute;margin-left:-46.95pt;margin-top:-39.85pt;width:524.3pt;height:115.05pt;z-index:251659264;visibility:visible;mso-wrap-style:square;mso-width-percent:0;mso-height-percent:0;mso-wrap-distance-left:9pt;mso-wrap-distance-top:0;mso-wrap-distance-right:9pt;mso-wrap-distance-bottom:0;mso-position-horizontal:absolute;mso-position-horizontal-relative:text;mso-position-vertical:absolute;mso-position-vertical-relative:text;mso-width-percent:0;mso-height-percent:0;mso-width-relative:page;mso-height-relative:page;v-text-anchor:middle" o:spid="_x0000_s1026" fillcolor="#04339f" stroked="f" strokeweight="1pt" w14:anchorId="060E793F" o:gfxdata="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">
                 <w10:wrap type="tight"/>
@@ -934,29 +934,7 @@
           <w:szCs w:val="20"/>
           <w:lang w:eastAsia="ja-JP"/>
         </w:rPr>
-        <w:t xml:space="preserve">recomendaciones incluyen </w:t>
-      </w:r>
-      <w:proofErr w:type="spellStart"/>
-      <w:r>
-        <w:rPr>
-          <w:rFonts w:ascii="Roboto Light" w:hAnsi="Roboto Light"/>
-          <w:color w:val="595959"/>
-          <w:sz w:val="20"/>
-          <w:szCs w:val="20"/>
-          <w:lang w:eastAsia="ja-JP"/>
-        </w:rPr>
-        <w:t>Notion</w:t>
-      </w:r>
-      <w:proofErr w:type="spellEnd"/>
-      <w:r>
-        <w:rPr>
-          <w:rFonts w:ascii="Roboto Light" w:hAnsi="Roboto Light"/>
-          <w:color w:val="595959"/>
-          <w:sz w:val="20"/>
-          <w:szCs w:val="20"/>
-          <w:lang w:eastAsia="ja-JP"/>
-        </w:rPr>
-        <w:t xml:space="preserve"> y Google Sites (ver enlaces), ya que son herramientas accesibles y</w:t>
+        <w:t>recomendaciones incluyen Notion y Google Sites (ver enlaces), ya que son herramientas accesibles y</w:t>
       </w:r>
       <w:r>
         <w:rPr>
@@ -1242,23 +1220,7 @@
           <w:rFonts w:ascii="Roboto Light" w:hAnsi="Roboto Light"/>
           <w:lang w:val="es-ES"/>
         </w:rPr>
-        <w:t xml:space="preserve">Recuerda usar </w:t>
-      </w:r>
-      <w:proofErr w:type="spellStart"/>
-      <w:r>
-        <w:rPr>
-          <w:rFonts w:ascii="Roboto Light" w:hAnsi="Roboto Light"/>
-          <w:lang w:val="es-ES"/>
-        </w:rPr>
-        <w:t>Notion</w:t>
-      </w:r>
-      <w:proofErr w:type="spellEnd"/>
-      <w:r>
-        <w:rPr>
-          <w:rFonts w:ascii="Roboto Light" w:hAnsi="Roboto Light"/>
-          <w:lang w:val="es-ES"/>
-        </w:rPr>
-        <w:t xml:space="preserve"> como herramienta para planificar reuniones de tu equipo, organizar las tareas de cada miembro del equipo </w:t>
+        <w:t xml:space="preserve">Recuerda usar Notion como herramienta para planificar reuniones de tu equipo, organizar las tareas de cada miembro del equipo </w:t>
       </w:r>
       <w:r>
         <w:rPr>
@@ -1286,23 +1248,7 @@
           <w:rFonts w:ascii="Roboto Light" w:hAnsi="Roboto Light"/>
           <w:lang w:val="es-ES"/>
         </w:rPr>
-        <w:t xml:space="preserve">llevar el control. El uso de </w:t>
-      </w:r>
-      <w:proofErr w:type="spellStart"/>
-      <w:r>
-        <w:rPr>
-          <w:rFonts w:ascii="Roboto Light" w:hAnsi="Roboto Light"/>
-          <w:lang w:val="es-ES"/>
-        </w:rPr>
-        <w:t>Notion es u</w:t>
-      </w:r>
-      <w:proofErr w:type="spellEnd"/>
-      <w:r>
-        <w:rPr>
-          <w:rFonts w:ascii="Roboto Light" w:hAnsi="Roboto Light"/>
-          <w:lang w:val="es-ES"/>
-        </w:rPr>
-        <w:t>n 10% de la nota del reto Big Data, que se sumará a tus entregables.</w:t>
+        <w:t>llevar el control. El uso de Notion es un 10% de la nota del reto Big Data, que se sumará a tus entregables.</w:t>
       </w:r>
     </w:p>
     <w:p>
@@ -1728,7 +1674,6 @@
               <w:bottom w:val="single" w:sz="6" w:space="0" w:color="auto"/>
               <w:right w:val="single" w:sz="6" w:space="0" w:color="auto"/>
             </w:tcBorders>
-            <w:shd w:val="clear" w:color="auto" w:fill="auto"/>
             <w:hideMark/>
           </w:tcPr>
           <w:p>
@@ -1848,7 +1793,6 @@
               <w:bottom w:val="single" w:sz="6" w:space="0" w:color="auto"/>
               <w:right w:val="single" w:sz="6" w:space="0" w:color="auto"/>
             </w:tcBorders>
-            <w:shd w:val="clear" w:color="auto" w:fill="auto"/>
             <w:hideMark/>
           </w:tcPr>
           <w:p>
@@ -1990,29 +1934,7 @@
                 <w:szCs w:val="20"/>
                 <w:lang w:eastAsia="es-ES"/>
               </w:rPr>
-              <w:t xml:space="preserve">tus propias </w:t>
-            </w:r>
-            <w:proofErr w:type="gramStart"/>
-            <w:r>
-              <w:rPr>
-                <w:rFonts w:ascii="Roboto Light" w:eastAsia="Times New Roman" w:hAnsi="Roboto Light" w:cs="Segoe UI"/>
-                <w:color w:val="595959" w:themeColor="text1" w:themeTint="A6"/>
-                <w:sz w:val="20"/>
-                <w:szCs w:val="20"/>
-                <w:lang w:eastAsia="es-ES"/>
-              </w:rPr>
-              <w:t>palabras</w:t>
-            </w:r>
-            <w:proofErr w:type="gramEnd"/>
-            <w:r>
-              <w:rPr>
-                <w:rFonts w:ascii="Roboto Light" w:eastAsia="Times New Roman" w:hAnsi="Roboto Light" w:cs="Segoe UI"/>
-                <w:color w:val="595959" w:themeColor="text1" w:themeTint="A6"/>
-                <w:sz w:val="20"/>
-                <w:szCs w:val="20"/>
-                <w:lang w:eastAsia="es-ES"/>
-              </w:rPr>
-              <w:t xml:space="preserve"> aunque el lenguaje usado no sea 100% formal. De esta forma </w:t>
+              <w:t xml:space="preserve">tus propias palabras aunque el lenguaje usado no sea 100% formal. De esta forma </w:t>
             </w:r>
             <w:r>
               <w:rPr>
@@ -2212,23 +2134,7 @@
                 <w:rFonts w:ascii="Roboto Light" w:hAnsi="Roboto Light"/>
                 <w:lang w:val="es-ES"/>
               </w:rPr>
-              <w:t xml:space="preserve"> si la máquina virtual se queda corta, se puede </w:t>
-            </w:r>
-            <w:proofErr w:type="spellStart"/>
-            <w:r>
-              <w:rPr>
-                <w:rFonts w:ascii="Roboto Light" w:hAnsi="Roboto Light"/>
-                <w:lang w:val="es-ES"/>
-              </w:rPr>
-              <w:t>reescalar</w:t>
-            </w:r>
-            <w:proofErr w:type="spellEnd"/>
-            <w:r>
-              <w:rPr>
-                <w:rFonts w:ascii="Roboto Light" w:hAnsi="Roboto Light"/>
-                <w:lang w:val="es-ES"/>
-              </w:rPr>
-              <w:t xml:space="preserve"> añadiendo más potencia fácilmente.</w:t>
+              <w:t xml:space="preserve"> si la máquina virtual se queda corta, se puede reescalar añadiendo más potencia fácilmente.</w:t>
             </w:r>
           </w:p>
         </w:tc>
@@ -2392,7 +2298,6 @@
                 <w:lang w:val="es-ES"/>
               </w:rPr>
             </w:pPr>
-            <w:proofErr w:type="spellStart"/>
             <w:r>
               <w:rPr>
                 <w:rFonts w:ascii="Roboto Light" w:hAnsi="Roboto Light"/>
@@ -2400,7 +2305,6 @@
               </w:rPr>
               <w:t>DynamoDB</w:t>
             </w:r>
-            <w:proofErr w:type="spellEnd"/>
           </w:p>
         </w:tc>
         <w:tc>
@@ -2441,7 +2345,6 @@
                 <w:lang w:val="es-ES"/>
               </w:rPr>
             </w:pPr>
-            <w:proofErr w:type="spellStart"/>
             <w:r>
               <w:rPr>
                 <w:rFonts w:ascii="Roboto Light" w:hAnsi="Roboto Light"/>
@@ -2456,7 +2359,6 @@
               </w:rPr>
               <w:t>front</w:t>
             </w:r>
-            <w:proofErr w:type="spellEnd"/>
           </w:p>
         </w:tc>
         <w:tc>
@@ -3012,7 +2914,6 @@
               <w:bottom w:val="single" w:sz="6" w:space="0" w:color="auto"/>
               <w:right w:val="single" w:sz="6" w:space="0" w:color="auto"/>
             </w:tcBorders>
-            <w:shd w:val="clear" w:color="auto" w:fill="auto"/>
             <w:hideMark/>
           </w:tcPr>
           <w:p>
@@ -3132,7 +3033,6 @@
               <w:bottom w:val="single" w:sz="6" w:space="0" w:color="auto"/>
               <w:right w:val="single" w:sz="6" w:space="0" w:color="auto"/>
             </w:tcBorders>
-            <w:shd w:val="clear" w:color="auto" w:fill="auto"/>
             <w:hideMark/>
           </w:tcPr>
           <w:p>
@@ -3474,23 +3374,7 @@
           <w:rFonts w:ascii="Roboto Light" w:hAnsi="Roboto Light"/>
           <w:lang w:val="es-ES"/>
         </w:rPr>
-        <w:t>¿</w:t>
-      </w:r>
-      <w:proofErr w:type="spellStart"/>
-      <w:r>
-        <w:rPr>
-          <w:rFonts w:ascii="Roboto Light" w:hAnsi="Roboto Light"/>
-          <w:lang w:val="es-ES"/>
-        </w:rPr>
-        <w:t>Cuantas</w:t>
-      </w:r>
-      <w:proofErr w:type="spellEnd"/>
-      <w:r>
-        <w:rPr>
-          <w:rFonts w:ascii="Roboto Light" w:hAnsi="Roboto Light"/>
-          <w:lang w:val="es-ES"/>
-        </w:rPr>
-        <w:t xml:space="preserve"> redes privadas hay?</w:t>
+        <w:t>¿Cuantas redes privadas hay?</w:t>
       </w:r>
     </w:p>
     <w:p>
@@ -3511,23 +3395,7 @@
           <w:rFonts w:ascii="Roboto Light" w:hAnsi="Roboto Light"/>
           <w:lang w:val="es-ES"/>
         </w:rPr>
-        <w:t xml:space="preserve">¿En cuantos </w:t>
-      </w:r>
-      <w:proofErr w:type="spellStart"/>
-      <w:r>
-        <w:rPr>
-          <w:rFonts w:ascii="Roboto Light" w:hAnsi="Roboto Light"/>
-          <w:lang w:val="es-ES"/>
-        </w:rPr>
-        <w:t>CPDs</w:t>
-      </w:r>
-      <w:proofErr w:type="spellEnd"/>
-      <w:r>
-        <w:rPr>
-          <w:rFonts w:ascii="Roboto Light" w:hAnsi="Roboto Light"/>
-          <w:lang w:val="es-ES"/>
-        </w:rPr>
-        <w:t xml:space="preserve"> se ubica el servicio?</w:t>
+        <w:t>¿En cuantos CPDs se ubica el servicio?</w:t>
       </w:r>
     </w:p>
     <w:p>
@@ -3804,23 +3672,7 @@
           <w:rFonts w:ascii="Roboto Light" w:hAnsi="Roboto Light"/>
           <w:lang w:val="es-ES"/>
         </w:rPr>
-        <w:t xml:space="preserve">el procedimiento que habéis </w:t>
-      </w:r>
-      <w:proofErr w:type="gramStart"/>
-      <w:r>
-        <w:rPr>
-          <w:rFonts w:ascii="Roboto Light" w:hAnsi="Roboto Light"/>
-          <w:lang w:val="es-ES"/>
-        </w:rPr>
-        <w:t>seguido</w:t>
-      </w:r>
-      <w:proofErr w:type="gramEnd"/>
-      <w:r>
-        <w:rPr>
-          <w:rFonts w:ascii="Roboto Light" w:hAnsi="Roboto Light"/>
-          <w:lang w:val="es-ES"/>
-        </w:rPr>
-        <w:t xml:space="preserve"> así como incluir capturas de pantalla del proceso.  </w:t>
+        <w:t xml:space="preserve">el procedimiento que habéis seguido así como incluir capturas de pantalla del proceso.  </w:t>
       </w:r>
     </w:p>
     <w:p>
@@ -3842,7 +3694,7 @@
           <w:lang w:val="es-ES"/>
         </w:rPr>
         <w:drawing>
-          <wp:anchor distT="0" distB="0" distL="114300" distR="114300" simplePos="0" relativeHeight="251661312" behindDoc="1" locked="0" layoutInCell="1" allowOverlap="1" wp14:anchorId="75F892BA" wp14:editId="1DFB9622">
+          <wp:anchor distT="0" distB="0" distL="114300" distR="114300" simplePos="0" relativeHeight="251661312" behindDoc="1" locked="0" layoutInCell="1" allowOverlap="1" wp14:anchorId="75F892BA" wp14:editId="02432282">
             <wp:simplePos x="0" y="0"/>
             <wp:positionH relativeFrom="column">
               <wp:posOffset>3971925</wp:posOffset>
@@ -3923,25 +3775,8 @@
           <w:rFonts w:ascii="Roboto Light" w:hAnsi="Roboto Light"/>
           <w:lang w:val="es-ES"/>
         </w:rPr>
-        <w:t xml:space="preserve">Accede al módulo 6 de AWS </w:t>
-      </w:r>
-      <w:proofErr w:type="spellStart"/>
-      <w:r>
-        <w:rPr>
-          <w:rFonts w:ascii="Roboto Light" w:hAnsi="Roboto Light"/>
-          <w:lang w:val="es-ES"/>
-        </w:rPr>
-        <w:t>Educate</w:t>
-      </w:r>
-      <w:proofErr w:type="spellEnd"/>
-      <w:r>
-        <w:rPr>
-          <w:rFonts w:ascii="Roboto Light" w:hAnsi="Roboto Light"/>
-          <w:lang w:val="es-ES"/>
-        </w:rPr>
-        <w:t xml:space="preserve"> que habla sobre EC2. Una vez allí abre el laboratorio </w:t>
-      </w:r>
-      <w:proofErr w:type="spellStart"/>
+        <w:t xml:space="preserve">Accede al módulo 6 de AWS Educate que habla sobre EC2. Una vez allí abre el laboratorio </w:t>
+      </w:r>
       <w:r>
         <w:rPr>
           <w:rFonts w:ascii="Roboto Light" w:hAnsi="Roboto Light"/>
@@ -3949,57 +3784,7 @@
           <w:bCs/>
           <w:lang w:val="es-ES"/>
         </w:rPr>
-        <w:t>Lab</w:t>
-      </w:r>
-      <w:proofErr w:type="spellEnd"/>
-      <w:r>
-        <w:rPr>
-          <w:rFonts w:ascii="Roboto Light" w:hAnsi="Roboto Light"/>
-          <w:b/>
-          <w:bCs/>
-          <w:lang w:val="es-ES"/>
-        </w:rPr>
-        <w:t xml:space="preserve"> 3 - </w:t>
-      </w:r>
-      <w:proofErr w:type="spellStart"/>
-      <w:r>
-        <w:rPr>
-          <w:rFonts w:ascii="Roboto Light" w:hAnsi="Roboto Light"/>
-          <w:b/>
-          <w:bCs/>
-          <w:lang w:val="es-ES"/>
-        </w:rPr>
-        <w:t>Introduction</w:t>
-      </w:r>
-      <w:proofErr w:type="spellEnd"/>
-      <w:r>
-        <w:rPr>
-          <w:rFonts w:ascii="Roboto Light" w:hAnsi="Roboto Light"/>
-          <w:b/>
-          <w:bCs/>
-          <w:lang w:val="es-ES"/>
-        </w:rPr>
-        <w:t xml:space="preserve"> </w:t>
-      </w:r>
-      <w:proofErr w:type="spellStart"/>
-      <w:r>
-        <w:rPr>
-          <w:rFonts w:ascii="Roboto Light" w:hAnsi="Roboto Light"/>
-          <w:b/>
-          <w:bCs/>
-          <w:lang w:val="es-ES"/>
-        </w:rPr>
-        <w:t>to</w:t>
-      </w:r>
-      <w:proofErr w:type="spellEnd"/>
-      <w:r>
-        <w:rPr>
-          <w:rFonts w:ascii="Roboto Light" w:hAnsi="Roboto Light"/>
-          <w:b/>
-          <w:bCs/>
-          <w:lang w:val="es-ES"/>
-        </w:rPr>
-        <w:t xml:space="preserve"> Amazon EC2</w:t>
+        <w:t>Lab 3 - Introduction to Amazon EC2</w:t>
       </w:r>
       <w:r>
         <w:rPr>
@@ -4153,55 +3938,7 @@
           <w:rFonts w:ascii="Roboto Light" w:hAnsi="Roboto Light"/>
           <w:lang w:val="es-ES"/>
         </w:rPr>
-        <w:t xml:space="preserve">La página web puede ser un </w:t>
-      </w:r>
-      <w:proofErr w:type="spellStart"/>
-      <w:r>
-        <w:rPr>
-          <w:rFonts w:ascii="Roboto Light" w:hAnsi="Roboto Light"/>
-          <w:lang w:val="es-ES"/>
-        </w:rPr>
-        <w:t>hello</w:t>
-      </w:r>
-      <w:proofErr w:type="spellEnd"/>
-      <w:r>
-        <w:rPr>
-          <w:rFonts w:ascii="Roboto Light" w:hAnsi="Roboto Light"/>
-          <w:lang w:val="es-ES"/>
-        </w:rPr>
-        <w:t xml:space="preserve"> </w:t>
-      </w:r>
-      <w:proofErr w:type="spellStart"/>
-      <w:r>
-        <w:rPr>
-          <w:rFonts w:ascii="Roboto Light" w:hAnsi="Roboto Light"/>
-          <w:lang w:val="es-ES"/>
-        </w:rPr>
-        <w:t>world</w:t>
-      </w:r>
-      <w:proofErr w:type="spellEnd"/>
-      <w:r>
-        <w:rPr>
-          <w:rFonts w:ascii="Roboto Light" w:hAnsi="Roboto Light"/>
-          <w:lang w:val="es-ES"/>
-        </w:rPr>
-        <w:t xml:space="preserve"> con un simple &lt;</w:t>
-      </w:r>
-      <w:proofErr w:type="spellStart"/>
-      <w:r>
-        <w:rPr>
-          <w:rFonts w:ascii="Roboto Light" w:hAnsi="Roboto Light"/>
-          <w:lang w:val="es-ES"/>
-        </w:rPr>
-        <w:t>body</w:t>
-      </w:r>
-      <w:proofErr w:type="spellEnd"/>
-      <w:r>
-        <w:rPr>
-          <w:rFonts w:ascii="Roboto Light" w:hAnsi="Roboto Light"/>
-          <w:lang w:val="es-ES"/>
-        </w:rPr>
-        <w:t>&gt; y &lt;h1&gt;</w:t>
+        <w:t>La página web puede ser un hello world con un simple &lt;body&gt; y &lt;h1&gt;</w:t>
       </w:r>
     </w:p>
     <w:p>
@@ -4303,23 +4040,7 @@
           <w:rFonts w:ascii="Roboto Light" w:hAnsi="Roboto Light"/>
           <w:lang w:val="es-ES"/>
         </w:rPr>
-        <w:t xml:space="preserve">Si necesitas ayuda puedes usar los pasos que proporcionados en la plataforma AWS </w:t>
-      </w:r>
-      <w:proofErr w:type="spellStart"/>
-      <w:r>
-        <w:rPr>
-          <w:rFonts w:ascii="Roboto Light" w:hAnsi="Roboto Light"/>
-          <w:lang w:val="es-ES"/>
-        </w:rPr>
-        <w:t>Educate</w:t>
-      </w:r>
-      <w:proofErr w:type="spellEnd"/>
-      <w:r>
-        <w:rPr>
-          <w:rFonts w:ascii="Roboto Light" w:hAnsi="Roboto Light"/>
-          <w:lang w:val="es-ES"/>
-        </w:rPr>
-        <w:t xml:space="preserve">. Al finalizar recuerda cerrar el laboratorio </w:t>
+        <w:t xml:space="preserve">Si necesitas ayuda puedes usar los pasos que proporcionados en la plataforma AWS Educate. Al finalizar recuerda cerrar el laboratorio </w:t>
       </w:r>
       <w:r>
         <w:rPr>
@@ -4414,39 +4135,7 @@
           <w:rFonts w:ascii="Roboto Light" w:hAnsi="Roboto Light"/>
           <w:lang w:val="es-ES"/>
         </w:rPr>
-        <w:t>[CS02] 0.5 puntos. Captura del navegador web con la página web desplegada (</w:t>
-      </w:r>
-      <w:proofErr w:type="spellStart"/>
-      <w:r>
-        <w:rPr>
-          <w:rFonts w:ascii="Roboto Light" w:hAnsi="Roboto Light"/>
-          <w:lang w:val="es-ES"/>
-        </w:rPr>
-        <w:t>hello</w:t>
-      </w:r>
-      <w:proofErr w:type="spellEnd"/>
-      <w:r>
-        <w:rPr>
-          <w:rFonts w:ascii="Roboto Light" w:hAnsi="Roboto Light"/>
-          <w:lang w:val="es-ES"/>
-        </w:rPr>
-        <w:t xml:space="preserve"> </w:t>
-      </w:r>
-      <w:proofErr w:type="spellStart"/>
-      <w:r>
-        <w:rPr>
-          <w:rFonts w:ascii="Roboto Light" w:hAnsi="Roboto Light"/>
-          <w:lang w:val="es-ES"/>
-        </w:rPr>
-        <w:t>world</w:t>
-      </w:r>
-      <w:proofErr w:type="spellEnd"/>
-      <w:r>
-        <w:rPr>
-          <w:rFonts w:ascii="Roboto Light" w:hAnsi="Roboto Light"/>
-          <w:lang w:val="es-ES"/>
-        </w:rPr>
-        <w:t xml:space="preserve"> o superior)</w:t>
+        <w:t>[CS02] 0.5 puntos. Captura del navegador web con la página web desplegada (hello world o superior)</w:t>
       </w:r>
     </w:p>
     <w:p>
@@ -4497,39 +4186,7 @@
           <w:rFonts w:ascii="Roboto Light" w:hAnsi="Roboto Light"/>
           <w:lang w:val="es-ES"/>
         </w:rPr>
-        <w:t xml:space="preserve">[CS05] 0.5 puntos. Captura del tamaño de la instancia de Amazon EC2 </w:t>
-      </w:r>
-      <w:proofErr w:type="spellStart"/>
-      <w:r>
-        <w:rPr>
-          <w:rFonts w:ascii="Roboto Light" w:hAnsi="Roboto Light"/>
-          <w:lang w:val="es-ES"/>
-        </w:rPr>
-        <w:t>reescalada</w:t>
-      </w:r>
-      <w:proofErr w:type="spellEnd"/>
-      <w:r>
-        <w:rPr>
-          <w:rFonts w:ascii="Roboto Light" w:hAnsi="Roboto Light"/>
-          <w:lang w:val="es-ES"/>
-        </w:rPr>
-        <w:t xml:space="preserve"> a la escala necesaria (antes y después del </w:t>
-      </w:r>
-      <w:proofErr w:type="spellStart"/>
-      <w:r>
-        <w:rPr>
-          <w:rFonts w:ascii="Roboto Light" w:hAnsi="Roboto Light"/>
-          <w:lang w:val="es-ES"/>
-        </w:rPr>
-        <w:t>reescalado</w:t>
-      </w:r>
-      <w:proofErr w:type="spellEnd"/>
-      <w:r>
-        <w:rPr>
-          <w:rFonts w:ascii="Roboto Light" w:hAnsi="Roboto Light"/>
-          <w:lang w:val="es-ES"/>
-        </w:rPr>
-        <w:t>)</w:t>
+        <w:t>[CS05] 0.5 puntos. Captura del tamaño de la instancia de Amazon EC2 reescalada a la escala necesaria (antes y después del reescalado)</w:t>
       </w:r>
     </w:p>
     <w:p>
@@ -4626,22 +4283,8 @@
           <w:szCs w:val="28"/>
           <w:lang w:val="es-ES"/>
         </w:rPr>
-        <w:t xml:space="preserve">o y </w:t>
-      </w:r>
-      <w:proofErr w:type="spellStart"/>
-      <w:r>
-        <w:rPr>
-          <w:rFonts w:ascii="Roboto" w:hAnsi="Roboto" w:cs="Calibri Light"/>
-          <w:b w:val="0"/>
-          <w:bCs w:val="0"/>
-          <w:color w:val="04339F"/>
-          <w:sz w:val="28"/>
-          <w:szCs w:val="28"/>
-          <w:lang w:val="es-ES"/>
-        </w:rPr>
-        <w:t>autoscaling</w:t>
-      </w:r>
-      <w:proofErr w:type="spellEnd"/>
+        <w:t>o y autoscaling</w:t>
+      </w:r>
     </w:p>
     <w:p>
       <w:pPr>
@@ -4770,23 +4413,7 @@
           <w:rFonts w:ascii="Roboto Light" w:hAnsi="Roboto Light"/>
           <w:lang w:val="es-ES"/>
         </w:rPr>
-        <w:t xml:space="preserve">l servicio debe ser </w:t>
-      </w:r>
-      <w:proofErr w:type="spellStart"/>
-      <w:r>
-        <w:rPr>
-          <w:rFonts w:ascii="Roboto Light" w:hAnsi="Roboto Light"/>
-          <w:lang w:val="es-ES"/>
-        </w:rPr>
-        <w:t>autoescalado</w:t>
-      </w:r>
-      <w:proofErr w:type="spellEnd"/>
-      <w:r>
-        <w:rPr>
-          <w:rFonts w:ascii="Roboto Light" w:hAnsi="Roboto Light"/>
-          <w:lang w:val="es-ES"/>
-        </w:rPr>
-        <w:t xml:space="preserve"> y balanceado. La infraestructura a crear es la siguiente:</w:t>
+        <w:t>l servicio debe ser autoescalado y balanceado. La infraestructura a crear es la siguiente:</w:t>
       </w:r>
     </w:p>
     <w:p>
@@ -4907,39 +4534,7 @@
           <w:rFonts w:ascii="Roboto Light" w:hAnsi="Roboto Light"/>
           <w:lang w:val="es-ES"/>
         </w:rPr>
-        <w:t xml:space="preserve">ccede al módulo 10 de AWS </w:t>
-      </w:r>
-      <w:proofErr w:type="spellStart"/>
-      <w:r>
-        <w:rPr>
-          <w:rFonts w:ascii="Roboto Light" w:hAnsi="Roboto Light"/>
-          <w:lang w:val="es-ES"/>
-        </w:rPr>
-        <w:t>Educate</w:t>
-      </w:r>
-      <w:proofErr w:type="spellEnd"/>
-      <w:r>
-        <w:rPr>
-          <w:rFonts w:ascii="Roboto Light" w:hAnsi="Roboto Light"/>
-          <w:lang w:val="es-ES"/>
-        </w:rPr>
-        <w:t xml:space="preserve"> que habla sobre </w:t>
-      </w:r>
-      <w:proofErr w:type="spellStart"/>
-      <w:r>
-        <w:rPr>
-          <w:rFonts w:ascii="Roboto Light" w:hAnsi="Roboto Light"/>
-          <w:lang w:val="es-ES"/>
-        </w:rPr>
-        <w:t>Autoscaling</w:t>
-      </w:r>
-      <w:proofErr w:type="spellEnd"/>
-      <w:r>
-        <w:rPr>
-          <w:rFonts w:ascii="Roboto Light" w:hAnsi="Roboto Light"/>
-          <w:lang w:val="es-ES"/>
-        </w:rPr>
-        <w:t>. Una vez allí abre e</w:t>
+        <w:t>ccede al módulo 10 de AWS Educate que habla sobre Autoscaling. Una vez allí abre e</w:t>
       </w:r>
       <w:r>
         <w:rPr>
@@ -4948,7 +4543,6 @@
         </w:rPr>
         <w:t xml:space="preserve">l </w:t>
       </w:r>
-      <w:proofErr w:type="gramStart"/>
       <w:r>
         <w:rPr>
           <w:rFonts w:ascii="Roboto Light" w:hAnsi="Roboto Light"/>
@@ -4956,7 +4550,6 @@
         </w:rPr>
         <w:t xml:space="preserve">laboratorio  </w:t>
       </w:r>
-      <w:proofErr w:type="spellStart"/>
       <w:r>
         <w:rPr>
           <w:rFonts w:ascii="Roboto Light" w:hAnsi="Roboto Light"/>
@@ -4964,70 +4557,8 @@
           <w:bCs/>
           <w:lang w:val="es-ES"/>
         </w:rPr>
-        <w:t>Lab</w:t>
-      </w:r>
-      <w:proofErr w:type="spellEnd"/>
-      <w:proofErr w:type="gramEnd"/>
-      <w:r>
-        <w:rPr>
-          <w:rFonts w:ascii="Roboto Light" w:hAnsi="Roboto Light"/>
-          <w:b/>
-          <w:bCs/>
-          <w:lang w:val="es-ES"/>
-        </w:rPr>
-        <w:t xml:space="preserve"> 6 - </w:t>
-      </w:r>
-      <w:proofErr w:type="spellStart"/>
-      <w:r>
-        <w:rPr>
-          <w:rFonts w:ascii="Roboto Light" w:hAnsi="Roboto Light"/>
-          <w:b/>
-          <w:bCs/>
-          <w:lang w:val="es-ES"/>
-        </w:rPr>
-        <w:t>Scale</w:t>
-      </w:r>
-      <w:proofErr w:type="spellEnd"/>
-      <w:r>
-        <w:rPr>
-          <w:rFonts w:ascii="Roboto Light" w:hAnsi="Roboto Light"/>
-          <w:b/>
-          <w:bCs/>
-          <w:lang w:val="es-ES"/>
-        </w:rPr>
-        <w:t xml:space="preserve"> &amp; Load Balance </w:t>
-      </w:r>
-      <w:proofErr w:type="spellStart"/>
-      <w:r>
-        <w:rPr>
-          <w:rFonts w:ascii="Roboto Light" w:hAnsi="Roboto Light"/>
-          <w:b/>
-          <w:bCs/>
-          <w:lang w:val="es-ES"/>
-        </w:rPr>
-        <w:t>your</w:t>
-      </w:r>
-      <w:proofErr w:type="spellEnd"/>
-      <w:r>
-        <w:rPr>
-          <w:rFonts w:ascii="Roboto Light" w:hAnsi="Roboto Light"/>
-          <w:b/>
-          <w:bCs/>
-          <w:lang w:val="es-ES"/>
-        </w:rPr>
-        <w:t xml:space="preserve"> </w:t>
-      </w:r>
-      <w:proofErr w:type="spellStart"/>
-      <w:r>
-        <w:rPr>
-          <w:rFonts w:ascii="Roboto Light" w:hAnsi="Roboto Light"/>
-          <w:b/>
-          <w:bCs/>
-          <w:lang w:val="es-ES"/>
-        </w:rPr>
-        <w:t>Architecture</w:t>
-      </w:r>
-      <w:proofErr w:type="spellEnd"/>
+        <w:t>Lab 6 - Scale &amp; Load Balance your Architecture</w:t>
+      </w:r>
       <w:r>
         <w:rPr>
           <w:rFonts w:ascii="Roboto Light" w:hAnsi="Roboto Light"/>
@@ -5040,7 +4571,7 @@
           <w:noProof/>
         </w:rPr>
         <w:drawing>
-          <wp:inline distT="0" distB="0" distL="0" distR="0" wp14:anchorId="4747821B" wp14:editId="2A53CD20">
+          <wp:inline distT="0" distB="0" distL="0" distR="0" wp14:anchorId="4747821B" wp14:editId="32E47AAE">
             <wp:extent cx="286023" cy="169619"/>
             <wp:effectExtent l="0" t="0" r="6350" b="0"/>
             <wp:docPr id="527465934" name="Imagen 527465934"/>
@@ -5160,23 +4691,7 @@
           <w:rFonts w:ascii="Roboto Light" w:hAnsi="Roboto Light"/>
           <w:lang w:val="es-ES"/>
         </w:rPr>
-        <w:t xml:space="preserve"> en la plataforma AWS </w:t>
-      </w:r>
-      <w:proofErr w:type="spellStart"/>
-      <w:r>
-        <w:rPr>
-          <w:rFonts w:ascii="Roboto Light" w:hAnsi="Roboto Light"/>
-          <w:lang w:val="es-ES"/>
-        </w:rPr>
-        <w:t>Educate</w:t>
-      </w:r>
-      <w:proofErr w:type="spellEnd"/>
-      <w:r>
-        <w:rPr>
-          <w:rFonts w:ascii="Roboto Light" w:hAnsi="Roboto Light"/>
-          <w:lang w:val="es-ES"/>
-        </w:rPr>
-        <w:t>.</w:t>
+        <w:t xml:space="preserve"> en la plataforma AWS Educate.</w:t>
       </w:r>
     </w:p>
     <w:p>
@@ -5409,23 +4924,7 @@
           <w:rFonts w:ascii="Roboto Light" w:hAnsi="Roboto Light"/>
           <w:lang w:val="es-ES"/>
         </w:rPr>
-        <w:t xml:space="preserve">Captura del </w:t>
-      </w:r>
-      <w:proofErr w:type="spellStart"/>
-      <w:r>
-        <w:rPr>
-          <w:rFonts w:ascii="Roboto Light" w:hAnsi="Roboto Light"/>
-          <w:lang w:val="es-ES"/>
-        </w:rPr>
-        <w:t>autoescaling</w:t>
-      </w:r>
-      <w:proofErr w:type="spellEnd"/>
-      <w:r>
-        <w:rPr>
-          <w:rFonts w:ascii="Roboto Light" w:hAnsi="Roboto Light"/>
-          <w:lang w:val="es-ES"/>
-        </w:rPr>
-        <w:t xml:space="preserve"> creado</w:t>
+        <w:t>Captura del autoescaling creado</w:t>
       </w:r>
     </w:p>
     <w:p>
@@ -5449,17 +4948,8 @@
           <w:rFonts w:ascii="Roboto Light" w:hAnsi="Roboto Light"/>
           <w:lang w:val="es-ES"/>
         </w:rPr>
-        <w:t xml:space="preserve">Captura de las alarmas en </w:t>
-      </w:r>
-      <w:proofErr w:type="spellStart"/>
-      <w:r>
-        <w:rPr>
-          <w:rFonts w:ascii="Roboto Light" w:hAnsi="Roboto Light"/>
-          <w:lang w:val="es-ES"/>
-        </w:rPr>
-        <w:t>Cloudwatch</w:t>
-      </w:r>
-      <w:proofErr w:type="spellEnd"/>
+        <w:t>Captura de las alarmas en Cloudwatch</w:t>
+      </w:r>
     </w:p>
     <w:p>
       <w:pPr>
@@ -5500,7 +4990,6 @@
           <w:szCs w:val="28"/>
           <w:lang w:val="es-ES"/>
         </w:rPr>
-        <w:lastRenderedPageBreak/>
         <w:t>Sección #</w:t>
       </w:r>
       <w:r>
@@ -5549,22 +5038,8 @@
           <w:szCs w:val="28"/>
           <w:lang w:val="es-ES"/>
         </w:rPr>
-        <w:t xml:space="preserve"> AWS </w:t>
-      </w:r>
-      <w:proofErr w:type="spellStart"/>
-      <w:r>
-        <w:rPr>
-          <w:rFonts w:ascii="Roboto" w:hAnsi="Roboto" w:cs="Calibri Light"/>
-          <w:b w:val="0"/>
-          <w:bCs w:val="0"/>
-          <w:color w:val="04339F"/>
-          <w:sz w:val="28"/>
-          <w:szCs w:val="28"/>
-          <w:lang w:val="es-ES"/>
-        </w:rPr>
-        <w:t>Educate</w:t>
-      </w:r>
-      <w:proofErr w:type="spellEnd"/>
+        <w:t xml:space="preserve"> AWS Educate</w:t>
+      </w:r>
     </w:p>
     <w:p>
       <w:pPr>
@@ -5620,23 +5095,7 @@
           <w:rFonts w:ascii="Roboto Light" w:hAnsi="Roboto Light"/>
           <w:lang w:val="es-ES"/>
         </w:rPr>
-        <w:t xml:space="preserve">un laboratorio de AWS </w:t>
-      </w:r>
-      <w:proofErr w:type="spellStart"/>
-      <w:r>
-        <w:rPr>
-          <w:rFonts w:ascii="Roboto Light" w:hAnsi="Roboto Light"/>
-          <w:lang w:val="es-ES"/>
-        </w:rPr>
-        <w:t>Educate</w:t>
-      </w:r>
-      <w:proofErr w:type="spellEnd"/>
-      <w:r>
-        <w:rPr>
-          <w:rFonts w:ascii="Roboto Light" w:hAnsi="Roboto Light"/>
-          <w:lang w:val="es-ES"/>
-        </w:rPr>
-        <w:t>. Éste puede ser cualquiera excluyendo los ya realizados en la sección 2 y la sección 3 de este mismo documento.</w:t>
+        <w:t>un laboratorio de AWS Educate. Éste puede ser cualquiera excluyendo los ya realizados en la sección 2 y la sección 3 de este mismo documento.</w:t>
       </w:r>
     </w:p>
     <w:p>
@@ -5855,7 +5314,7 @@
 </file>
 
 <file path=word/endnotes.xml><?xml version="1.0" encoding="utf-8"?>
-<w:endnotes xmlns:wpc="http://schemas.microsoft.com/office/word/2010/wordprocessingCanvas" xmlns:cx="http://schemas.microsoft.com/office/drawing/2014/chartex" xmlns:cx1="http://schemas.microsoft.com/office/drawing/2015/9/8/chartex" xmlns:cx2="http://schemas.microsoft.com/office/drawing/2015/10/21/chartex" xmlns:cx3="http://schemas.microsoft.com/office/drawing/2016/5/9/chartex" xmlns:cx4="http://schemas.microsoft.com/office/drawing/2016/5/10/chartex" xmlns:cx5="http://schemas.microsoft.com/office/drawing/2016/5/11/chartex" xmlns:cx6="http://schemas.microsoft.com/office/drawing/2016/5/12/chartex" xmlns:cx7="http://schemas.microsoft.com/office/drawing/2016/5/13/chartex" xmlns:cx8="http://schemas.microsoft.com/office/drawing/2016/5/14/chartex" xmlns:mc="http://schemas.openxmlformats.org/markup-compatibility/2006" xmlns:aink="http://schemas.microsoft.com/office/drawing/2016/ink" xmlns:am3d="http://schemas.microsoft.com/office/drawing/2017/model3d" xmlns:o="urn:schemas-microsoft-com:office:office" xmlns:oel="http://schemas.microsoft.com/office/2019/extlst" xmlns:r="http://schemas.openxmlformats.org/officeDocument/2006/relationships" xmlns:m="http://schemas.openxmlformats.org/officeDocument/2006/math" xmlns:v="urn:schemas-microsoft-com:vml" xmlns:wp14="http://schemas.microsoft.com/office/word/2010/wordprocessingDrawing" xmlns:wp="http://schemas.openxmlformats.org/drawingml/2006/wordprocessingDrawing" xmlns:w10="urn:schemas-microsoft-com:office:word" xmlns:w="http://schemas.openxmlformats.org/wordprocessingml/2006/main" xmlns:w14="http://schemas.microsoft.com/office/word/2010/wordml" xmlns:w15="http://schemas.microsoft.com/office/word/2012/wordml" xmlns:w16cex="http://schemas.microsoft.com/office/word/2018/wordml/cex" xmlns:w16cid="http://schemas.microsoft.com/office/word/2016/wordml/cid" xmlns:w16="http://schemas.microsoft.com/office/word/2018/wordml" xmlns:w16sdtdh="http://schemas.microsoft.com/office/word/2020/wordml/sdtdatahash" xmlns:w16se="http://schemas.microsoft.com/office/word/2015/wordml/symex" xmlns:wpg="http://schemas.microsoft.com/office/word/2010/wordprocessingGroup" xmlns:wpi="http://schemas.microsoft.com/office/word/2010/wordprocessingInk" xmlns:wne="http://schemas.microsoft.com/office/word/2006/wordml" xmlns:wps="http://schemas.microsoft.com/office/word/2010/wordprocessingShape" mc:Ignorable="w14 w15 w16se w16cid w16 w16cex w16sdtdh wp14">
+<w:endnotes xmlns:wpc="http://schemas.microsoft.com/office/word/2010/wordprocessingCanvas" xmlns:cx="http://schemas.microsoft.com/office/drawing/2014/chartex" xmlns:cx1="http://schemas.microsoft.com/office/drawing/2015/9/8/chartex" xmlns:cx2="http://schemas.microsoft.com/office/drawing/2015/10/21/chartex" xmlns:cx3="http://schemas.microsoft.com/office/drawing/2016/5/9/chartex" xmlns:cx4="http://schemas.microsoft.com/office/drawing/2016/5/10/chartex" xmlns:cx5="http://schemas.microsoft.com/office/drawing/2016/5/11/chartex" xmlns:cx6="http://schemas.microsoft.com/office/drawing/2016/5/12/chartex" xmlns:cx7="http://schemas.microsoft.com/office/drawing/2016/5/13/chartex" xmlns:cx8="http://schemas.microsoft.com/office/drawing/2016/5/14/chartex" xmlns:mc="http://schemas.openxmlformats.org/markup-compatibility/2006" xmlns:aink="http://schemas.microsoft.com/office/drawing/2016/ink" xmlns:am3d="http://schemas.microsoft.com/office/drawing/2017/model3d" xmlns:o="urn:schemas-microsoft-com:office:office" xmlns:oel="http://schemas.microsoft.com/office/2019/extlst" xmlns:r="http://schemas.openxmlformats.org/officeDocument/2006/relationships" xmlns:m="http://schemas.openxmlformats.org/officeDocument/2006/math" xmlns:v="urn:schemas-microsoft-com:vml" xmlns:wp14="http://schemas.microsoft.com/office/word/2010/wordprocessingDrawing" xmlns:wp="http://schemas.openxmlformats.org/drawingml/2006/wordprocessingDrawing" xmlns:w10="urn:schemas-microsoft-com:office:word" xmlns:w="http://schemas.openxmlformats.org/wordprocessingml/2006/main" xmlns:w14="http://schemas.microsoft.com/office/word/2010/wordml" xmlns:w15="http://schemas.microsoft.com/office/word/2012/wordml" xmlns:w16cex="http://schemas.microsoft.com/office/word/2018/wordml/cex" xmlns:w16cid="http://schemas.microsoft.com/office/word/2016/wordml/cid" xmlns:w16="http://schemas.microsoft.com/office/word/2018/wordml" xmlns:w16du="http://schemas.microsoft.com/office/word/2023/wordml/word16du" xmlns:w16sdtdh="http://schemas.microsoft.com/office/word/2020/wordml/sdtdatahash" xmlns:w16sdtfl="http://schemas.microsoft.com/office/word/2024/wordml/sdtformatlock" xmlns:w16se="http://schemas.microsoft.com/office/word/2015/wordml/symex" xmlns:wpg="http://schemas.microsoft.com/office/word/2010/wordprocessingGroup" xmlns:wpi="http://schemas.microsoft.com/office/word/2010/wordprocessingInk" xmlns:wne="http://schemas.microsoft.com/office/word/2006/wordml" xmlns:wps="http://schemas.microsoft.com/office/word/2010/wordprocessingShape" mc:Ignorable="w14 w15 w16se w16cid w16 w16cex w16sdtdh w16sdtfl w16du wp14">
   <w:endnote w:type="separator" w:id="-1">
     <w:p>
       <w:pPr>
@@ -5880,7 +5339,7 @@
 </file>
 
 <file path=word/footer1.xml><?xml version="1.0" encoding="utf-8"?>
-<w:ftr xmlns:wpc="http://schemas.microsoft.com/office/word/2010/wordprocessingCanvas" xmlns:cx="http://schemas.microsoft.com/office/drawing/2014/chartex" xmlns:cx1="http://schemas.microsoft.com/office/drawing/2015/9/8/chartex" xmlns:cx2="http://schemas.microsoft.com/office/drawing/2015/10/21/chartex" xmlns:cx3="http://schemas.microsoft.com/office/drawing/2016/5/9/chartex" xmlns:cx4="http://schemas.microsoft.com/office/drawing/2016/5/10/chartex" xmlns:cx5="http://schemas.microsoft.com/office/drawing/2016/5/11/chartex" xmlns:cx6="http://schemas.microsoft.com/office/drawing/2016/5/12/chartex" xmlns:cx7="http://schemas.microsoft.com/office/drawing/2016/5/13/chartex" xmlns:cx8="http://schemas.microsoft.com/office/drawing/2016/5/14/chartex" xmlns:mc="http://schemas.openxmlformats.org/markup-compatibility/2006" xmlns:aink="http://schemas.microsoft.com/office/drawing/2016/ink" xmlns:am3d="http://schemas.microsoft.com/office/drawing/2017/model3d" xmlns:o="urn:schemas-microsoft-com:office:office" xmlns:oel="http://schemas.microsoft.com/office/2019/extlst" xmlns:r="http://schemas.openxmlformats.org/officeDocument/2006/relationships" xmlns:m="http://schemas.openxmlformats.org/officeDocument/2006/math" xmlns:v="urn:schemas-microsoft-com:vml" xmlns:wp14="http://schemas.microsoft.com/office/word/2010/wordprocessingDrawing" xmlns:wp="http://schemas.openxmlformats.org/drawingml/2006/wordprocessingDrawing" xmlns:w10="urn:schemas-microsoft-com:office:word" xmlns:w="http://schemas.openxmlformats.org/wordprocessingml/2006/main" xmlns:w14="http://schemas.microsoft.com/office/word/2010/wordml" xmlns:w15="http://schemas.microsoft.com/office/word/2012/wordml" xmlns:w16cex="http://schemas.microsoft.com/office/word/2018/wordml/cex" xmlns:w16cid="http://schemas.microsoft.com/office/word/2016/wordml/cid" xmlns:w16="http://schemas.microsoft.com/office/word/2018/wordml" xmlns:w16sdtdh="http://schemas.microsoft.com/office/word/2020/wordml/sdtdatahash" xmlns:w16se="http://schemas.microsoft.com/office/word/2015/wordml/symex" xmlns:wpg="http://schemas.microsoft.com/office/word/2010/wordprocessingGroup" xmlns:wpi="http://schemas.microsoft.com/office/word/2010/wordprocessingInk" xmlns:wne="http://schemas.microsoft.com/office/word/2006/wordml" xmlns:wps="http://schemas.microsoft.com/office/word/2010/wordprocessingShape" mc:Ignorable="w14 w15 w16se w16cid w16 w16cex w16sdtdh wp14">
+<w:ftr xmlns:wpc="http://schemas.microsoft.com/office/word/2010/wordprocessingCanvas" xmlns:cx="http://schemas.microsoft.com/office/drawing/2014/chartex" xmlns:cx1="http://schemas.microsoft.com/office/drawing/2015/9/8/chartex" xmlns:cx2="http://schemas.microsoft.com/office/drawing/2015/10/21/chartex" xmlns:cx3="http://schemas.microsoft.com/office/drawing/2016/5/9/chartex" xmlns:cx4="http://schemas.microsoft.com/office/drawing/2016/5/10/chartex" xmlns:cx5="http://schemas.microsoft.com/office/drawing/2016/5/11/chartex" xmlns:cx6="http://schemas.microsoft.com/office/drawing/2016/5/12/chartex" xmlns:cx7="http://schemas.microsoft.com/office/drawing/2016/5/13/chartex" xmlns:cx8="http://schemas.microsoft.com/office/drawing/2016/5/14/chartex" xmlns:mc="http://schemas.openxmlformats.org/markup-compatibility/2006" xmlns:aink="http://schemas.microsoft.com/office/drawing/2016/ink" xmlns:am3d="http://schemas.microsoft.com/office/drawing/2017/model3d" xmlns:o="urn:schemas-microsoft-com:office:office" xmlns:oel="http://schemas.microsoft.com/office/2019/extlst" xmlns:r="http://schemas.openxmlformats.org/officeDocument/2006/relationships" xmlns:m="http://schemas.openxmlformats.org/officeDocument/2006/math" xmlns:v="urn:schemas-microsoft-com:vml" xmlns:wp14="http://schemas.microsoft.com/office/word/2010/wordprocessingDrawing" xmlns:wp="http://schemas.openxmlformats.org/drawingml/2006/wordprocessingDrawing" xmlns:w10="urn:schemas-microsoft-com:office:word" xmlns:w="http://schemas.openxmlformats.org/wordprocessingml/2006/main" xmlns:w14="http://schemas.microsoft.com/office/word/2010/wordml" xmlns:w15="http://schemas.microsoft.com/office/word/2012/wordml" xmlns:w16cex="http://schemas.microsoft.com/office/word/2018/wordml/cex" xmlns:w16cid="http://schemas.microsoft.com/office/word/2016/wordml/cid" xmlns:w16="http://schemas.microsoft.com/office/word/2018/wordml" xmlns:w16du="http://schemas.microsoft.com/office/word/2023/wordml/word16du" xmlns:w16sdtdh="http://schemas.microsoft.com/office/word/2020/wordml/sdtdatahash" xmlns:w16sdtfl="http://schemas.microsoft.com/office/word/2024/wordml/sdtformatlock" xmlns:w16se="http://schemas.microsoft.com/office/word/2015/wordml/symex" xmlns:wpg="http://schemas.microsoft.com/office/word/2010/wordprocessingGroup" xmlns:wpi="http://schemas.microsoft.com/office/word/2010/wordprocessingInk" xmlns:wne="http://schemas.microsoft.com/office/word/2006/wordml" xmlns:wps="http://schemas.microsoft.com/office/word/2010/wordprocessingShape" mc:Ignorable="w14 w15 w16se w16cid w16 w16cex w16sdtdh w16sdtfl w16du wp14">
   <w:p>
     <w:pPr>
       <w:pStyle w:val="Piedepgina"/>
@@ -5956,7 +5415,7 @@
             </wp:anchor>
           </w:drawing>
         </mc:Choice>
-        <mc:Fallback xmlns:mv="urn:schemas-microsoft-com:mac:vml" xmlns:mo="http://schemas.microsoft.com/office/mac/office/2008/main" xmlns:a="http://schemas.openxmlformats.org/drawingml/2006/main">
+        <mc:Fallback xmlns:a="http://schemas.openxmlformats.org/drawingml/2006/main" xmlns:mo="http://schemas.microsoft.com/office/mac/office/2008/main" xmlns:mv="urn:schemas-microsoft-com:mac:vml">
           <w:pict>
             <v:rect id="Rectangle 13" style="position:absolute;margin-left:-12pt;margin-top:-1.45pt;width:607.8pt;height:49.65pt;z-index:251658752;visibility:visible;mso-wrap-style:square;mso-width-percent:0;mso-height-percent:0;mso-wrap-distance-left:9pt;mso-wrap-distance-top:0;mso-wrap-distance-right:9pt;mso-wrap-distance-bottom:0;mso-position-horizontal:absolute;mso-position-horizontal-relative:page;mso-position-vertical:absolute;mso-position-vertical-relative:text;mso-width-percent:0;mso-height-percent:0;mso-width-relative:margin;mso-height-relative:margin;v-text-anchor:middle" o:spid="_x0000_s1026" fillcolor="#04339f" stroked="f" strokeweight="1pt" w14:anchorId="4E87756A" o:gfxdata="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">
               <v:shadow on="t" type="perspective" opacity="26214f" offset="0,0" matrix="66847f,,,66847f"/>
@@ -5972,7 +5431,7 @@
 </file>
 
 <file path=word/footnotes.xml><?xml version="1.0" encoding="utf-8"?>
-<w:footnotes xmlns:wpc="http://schemas.microsoft.com/office/word/2010/wordprocessingCanvas" xmlns:cx="http://schemas.microsoft.com/office/drawing/2014/chartex" xmlns:cx1="http://schemas.microsoft.com/office/drawing/2015/9/8/chartex" xmlns:cx2="http://schemas.microsoft.com/office/drawing/2015/10/21/chartex" xmlns:cx3="http://schemas.microsoft.com/office/drawing/2016/5/9/chartex" xmlns:cx4="http://schemas.microsoft.com/office/drawing/2016/5/10/chartex" xmlns:cx5="http://schemas.microsoft.com/office/drawing/2016/5/11/chartex" xmlns:cx6="http://schemas.microsoft.com/office/drawing/2016/5/12/chartex" xmlns:cx7="http://schemas.microsoft.com/office/drawing/2016/5/13/chartex" xmlns:cx8="http://schemas.microsoft.com/office/drawing/2016/5/14/chartex" xmlns:mc="http://schemas.openxmlformats.org/markup-compatibility/2006" xmlns:aink="http://schemas.microsoft.com/office/drawing/2016/ink" xmlns:am3d="http://schemas.microsoft.com/office/drawing/2017/model3d" xmlns:o="urn:schemas-microsoft-com:office:office" xmlns:oel="http://schemas.microsoft.com/office/2019/extlst" xmlns:r="http://schemas.openxmlformats.org/officeDocument/2006/relationships" xmlns:m="http://schemas.openxmlformats.org/officeDocument/2006/math" xmlns:v="urn:schemas-microsoft-com:vml" xmlns:wp14="http://schemas.microsoft.com/office/word/2010/wordprocessingDrawing" xmlns:wp="http://schemas.openxmlformats.org/drawingml/2006/wordprocessingDrawing" xmlns:w10="urn:schemas-microsoft-com:office:word" xmlns:w="http://schemas.openxmlformats.org/wordprocessingml/2006/main" xmlns:w14="http://schemas.microsoft.com/office/word/2010/wordml" xmlns:w15="http://schemas.microsoft.com/office/word/2012/wordml" xmlns:w16cex="http://schemas.microsoft.com/office/word/2018/wordml/cex" xmlns:w16cid="http://schemas.microsoft.com/office/word/2016/wordml/cid" xmlns:w16="http://schemas.microsoft.com/office/word/2018/wordml" xmlns:w16sdtdh="http://schemas.microsoft.com/office/word/2020/wordml/sdtdatahash" xmlns:w16se="http://schemas.microsoft.com/office/word/2015/wordml/symex" xmlns:wpg="http://schemas.microsoft.com/office/word/2010/wordprocessingGroup" xmlns:wpi="http://schemas.microsoft.com/office/word/2010/wordprocessingInk" xmlns:wne="http://schemas.microsoft.com/office/word/2006/wordml" xmlns:wps="http://schemas.microsoft.com/office/word/2010/wordprocessingShape" mc:Ignorable="w14 w15 w16se w16cid w16 w16cex w16sdtdh wp14">
+<w:footnotes xmlns:wpc="http://schemas.microsoft.com/office/word/2010/wordprocessingCanvas" xmlns:cx="http://schemas.microsoft.com/office/drawing/2014/chartex" xmlns:cx1="http://schemas.microsoft.com/office/drawing/2015/9/8/chartex" xmlns:cx2="http://schemas.microsoft.com/office/drawing/2015/10/21/chartex" xmlns:cx3="http://schemas.microsoft.com/office/drawing/2016/5/9/chartex" xmlns:cx4="http://schemas.microsoft.com/office/drawing/2016/5/10/chartex" xmlns:cx5="http://schemas.microsoft.com/office/drawing/2016/5/11/chartex" xmlns:cx6="http://schemas.microsoft.com/office/drawing/2016/5/12/chartex" xmlns:cx7="http://schemas.microsoft.com/office/drawing/2016/5/13/chartex" xmlns:cx8="http://schemas.microsoft.com/office/drawing/2016/5/14/chartex" xmlns:mc="http://schemas.openxmlformats.org/markup-compatibility/2006" xmlns:aink="http://schemas.microsoft.com/office/drawing/2016/ink" xmlns:am3d="http://schemas.microsoft.com/office/drawing/2017/model3d" xmlns:o="urn:schemas-microsoft-com:office:office" xmlns:oel="http://schemas.microsoft.com/office/2019/extlst" xmlns:r="http://schemas.openxmlformats.org/officeDocument/2006/relationships" xmlns:m="http://schemas.openxmlformats.org/officeDocument/2006/math" xmlns:v="urn:schemas-microsoft-com:vml" xmlns:wp14="http://schemas.microsoft.com/office/word/2010/wordprocessingDrawing" xmlns:wp="http://schemas.openxmlformats.org/drawingml/2006/wordprocessingDrawing" xmlns:w10="urn:schemas-microsoft-com:office:word" xmlns:w="http://schemas.openxmlformats.org/wordprocessingml/2006/main" xmlns:w14="http://schemas.microsoft.com/office/word/2010/wordml" xmlns:w15="http://schemas.microsoft.com/office/word/2012/wordml" xmlns:w16cex="http://schemas.microsoft.com/office/word/2018/wordml/cex" xmlns:w16cid="http://schemas.microsoft.com/office/word/2016/wordml/cid" xmlns:w16="http://schemas.microsoft.com/office/word/2018/wordml" xmlns:w16du="http://schemas.microsoft.com/office/word/2023/wordml/word16du" xmlns:w16sdtdh="http://schemas.microsoft.com/office/word/2020/wordml/sdtdatahash" xmlns:w16sdtfl="http://schemas.microsoft.com/office/word/2024/wordml/sdtformatlock" xmlns:w16se="http://schemas.microsoft.com/office/word/2015/wordml/symex" xmlns:wpg="http://schemas.microsoft.com/office/word/2010/wordprocessingGroup" xmlns:wpi="http://schemas.microsoft.com/office/word/2010/wordprocessingInk" xmlns:wne="http://schemas.microsoft.com/office/word/2006/wordml" xmlns:wps="http://schemas.microsoft.com/office/word/2010/wordprocessingShape" mc:Ignorable="w14 w15 w16se w16cid w16 w16cex w16sdtdh w16sdtfl w16du wp14">
   <w:footnote w:type="separator" w:id="-1">
     <w:p>
       <w:pPr>
@@ -5999,7 +5458,7 @@
 </file>
 
 <file path=word/header1.xml><?xml version="1.0" encoding="utf-8"?>
-<w:hdr xmlns:wpc="http://schemas.microsoft.com/office/word/2010/wordprocessingCanvas" xmlns:cx="http://schemas.microsoft.com/office/drawing/2014/chartex" xmlns:cx1="http://schemas.microsoft.com/office/drawing/2015/9/8/chartex" xmlns:cx2="http://schemas.microsoft.com/office/drawing/2015/10/21/chartex" xmlns:cx3="http://schemas.microsoft.com/office/drawing/2016/5/9/chartex" xmlns:cx4="http://schemas.microsoft.com/office/drawing/2016/5/10/chartex" xmlns:cx5="http://schemas.microsoft.com/office/drawing/2016/5/11/chartex" xmlns:cx6="http://schemas.microsoft.com/office/drawing/2016/5/12/chartex" xmlns:cx7="http://schemas.microsoft.com/office/drawing/2016/5/13/chartex" xmlns:cx8="http://schemas.microsoft.com/office/drawing/2016/5/14/chartex" xmlns:mc="http://schemas.openxmlformats.org/markup-compatibility/2006" xmlns:aink="http://schemas.microsoft.com/office/drawing/2016/ink" xmlns:am3d="http://schemas.microsoft.com/office/drawing/2017/model3d" xmlns:o="urn:schemas-microsoft-com:office:office" xmlns:oel="http://schemas.microsoft.com/office/2019/extlst" xmlns:r="http://schemas.openxmlformats.org/officeDocument/2006/relationships" xmlns:m="http://schemas.openxmlformats.org/officeDocument/2006/math" xmlns:v="urn:schemas-microsoft-com:vml" xmlns:wp14="http://schemas.microsoft.com/office/word/2010/wordprocessingDrawing" xmlns:wp="http://schemas.openxmlformats.org/drawingml/2006/wordprocessingDrawing" xmlns:w10="urn:schemas-microsoft-com:office:word" xmlns:w="http://schemas.openxmlformats.org/wordprocessingml/2006/main" xmlns:w14="http://schemas.microsoft.com/office/word/2010/wordml" xmlns:w15="http://schemas.microsoft.com/office/word/2012/wordml" xmlns:w16cex="http://schemas.microsoft.com/office/word/2018/wordml/cex" xmlns:w16cid="http://schemas.microsoft.com/office/word/2016/wordml/cid" xmlns:w16="http://schemas.microsoft.com/office/word/2018/wordml" xmlns:w16sdtdh="http://schemas.microsoft.com/office/word/2020/wordml/sdtdatahash" xmlns:w16se="http://schemas.microsoft.com/office/word/2015/wordml/symex" xmlns:wpg="http://schemas.microsoft.com/office/word/2010/wordprocessingGroup" xmlns:wpi="http://schemas.microsoft.com/office/word/2010/wordprocessingInk" xmlns:wne="http://schemas.microsoft.com/office/word/2006/wordml" xmlns:wps="http://schemas.microsoft.com/office/word/2010/wordprocessingShape" mc:Ignorable="w14 w15 w16se w16cid w16 w16cex w16sdtdh wp14">
+<w:hdr xmlns:wpc="http://schemas.microsoft.com/office/word/2010/wordprocessingCanvas" xmlns:cx="http://schemas.microsoft.com/office/drawing/2014/chartex" xmlns:cx1="http://schemas.microsoft.com/office/drawing/2015/9/8/chartex" xmlns:cx2="http://schemas.microsoft.com/office/drawing/2015/10/21/chartex" xmlns:cx3="http://schemas.microsoft.com/office/drawing/2016/5/9/chartex" xmlns:cx4="http://schemas.microsoft.com/office/drawing/2016/5/10/chartex" xmlns:cx5="http://schemas.microsoft.com/office/drawing/2016/5/11/chartex" xmlns:cx6="http://schemas.microsoft.com/office/drawing/2016/5/12/chartex" xmlns:cx7="http://schemas.microsoft.com/office/drawing/2016/5/13/chartex" xmlns:cx8="http://schemas.microsoft.com/office/drawing/2016/5/14/chartex" xmlns:mc="http://schemas.openxmlformats.org/markup-compatibility/2006" xmlns:aink="http://schemas.microsoft.com/office/drawing/2016/ink" xmlns:am3d="http://schemas.microsoft.com/office/drawing/2017/model3d" xmlns:o="urn:schemas-microsoft-com:office:office" xmlns:oel="http://schemas.microsoft.com/office/2019/extlst" xmlns:r="http://schemas.openxmlformats.org/officeDocument/2006/relationships" xmlns:m="http://schemas.openxmlformats.org/officeDocument/2006/math" xmlns:v="urn:schemas-microsoft-com:vml" xmlns:wp14="http://schemas.microsoft.com/office/word/2010/wordprocessingDrawing" xmlns:wp="http://schemas.openxmlformats.org/drawingml/2006/wordprocessingDrawing" xmlns:w10="urn:schemas-microsoft-com:office:word" xmlns:w="http://schemas.openxmlformats.org/wordprocessingml/2006/main" xmlns:w14="http://schemas.microsoft.com/office/word/2010/wordml" xmlns:w15="http://schemas.microsoft.com/office/word/2012/wordml" xmlns:w16cex="http://schemas.microsoft.com/office/word/2018/wordml/cex" xmlns:w16cid="http://schemas.microsoft.com/office/word/2016/wordml/cid" xmlns:w16="http://schemas.microsoft.com/office/word/2018/wordml" xmlns:w16du="http://schemas.microsoft.com/office/word/2023/wordml/word16du" xmlns:w16sdtdh="http://schemas.microsoft.com/office/word/2020/wordml/sdtdatahash" xmlns:w16sdtfl="http://schemas.microsoft.com/office/word/2024/wordml/sdtformatlock" xmlns:w16se="http://schemas.microsoft.com/office/word/2015/wordml/symex" xmlns:wpg="http://schemas.microsoft.com/office/word/2010/wordprocessingGroup" xmlns:wpi="http://schemas.microsoft.com/office/word/2010/wordprocessingInk" xmlns:wne="http://schemas.microsoft.com/office/word/2006/wordml" xmlns:wps="http://schemas.microsoft.com/office/word/2010/wordprocessingShape" mc:Ignorable="w14 w15 w16se w16cid w16 w16cex w16sdtdh w16sdtfl w16du wp14">
   <w:p>
     <w:pPr>
       <w:pStyle w:val="Encabezado"/>
@@ -6149,7 +5608,7 @@
               <v:stroke joinstyle="miter"/>
               <v:path gradientshapeok="t" o:connecttype="rect"/>
             </v:shapetype>
-            <v:shape id="Text Box 3" o:spid="_x0000_s1028" type="#_x0000_t202" style="position:absolute;margin-left:-19.95pt;margin-top:-8.2pt;width:318.6pt;height:27.6pt;z-index:251657728;visibility:visible;mso-wrap-style:square;mso-width-percent:0;mso-height-percent:0;mso-wrap-distance-left:9pt;mso-wrap-distance-top:0;mso-wrap-distance-right:9pt;mso-wrap-distance-bottom:0;mso-position-horizontal:absolute;mso-position-horizontal-relative:text;mso-position-vertical:absolute;mso-position-vertical-relative:text;mso-width-percent:0;mso-height-percent:0;mso-width-relative:margin;mso-height-relative:margin;v-text-anchor:top" o:gfxdata="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" fillcolor="#04339f" stroked="f" strokeweight="1.5pt">
+            <v:shape id="Text Box 3" o:spid="_x0000_s1028" type="#_x0000_t202" style="position:absolute;margin-left:-19.95pt;margin-top:-8.2pt;width:318.6pt;height:27.6pt;z-index:251657728;visibility:visible;mso-wrap-style:square;mso-width-percent:0;mso-height-percent:0;mso-wrap-distance-left:9pt;mso-wrap-distance-top:0;mso-wrap-distance-right:9pt;mso-wrap-distance-bottom:0;mso-position-horizontal:absolute;mso-position-horizontal-relative:text;mso-position-vertical:absolute;mso-position-vertical-relative:text;mso-width-percent:0;mso-height-percent:0;mso-width-relative:margin;mso-height-relative:margin;v-text-anchor:top" o:gfxdata="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" fillcolor="#04339f" stroked="f" strokeweight="1.5pt">
               <v:textbox>
                 <w:txbxContent>
                   <w:p>
@@ -6368,7 +5827,7 @@
             </wp:anchor>
           </w:drawing>
         </mc:Choice>
-        <mc:Fallback xmlns:mv="urn:schemas-microsoft-com:mac:vml" xmlns:mo="http://schemas.microsoft.com/office/mac/office/2008/main" xmlns:a14="http://schemas.microsoft.com/office/drawing/2010/main" xmlns:pic="http://schemas.openxmlformats.org/drawingml/2006/picture" xmlns:a="http://schemas.openxmlformats.org/drawingml/2006/main">
+        <mc:Fallback xmlns:a="http://schemas.openxmlformats.org/drawingml/2006/main" xmlns:pic="http://schemas.openxmlformats.org/drawingml/2006/picture" xmlns:a14="http://schemas.microsoft.com/office/drawing/2010/main" xmlns:mo="http://schemas.microsoft.com/office/mac/office/2008/main" xmlns:mv="urn:schemas-microsoft-com:mac:vml">
           <w:pict>
             <v:rect id="Rectangle 1" style="position:absolute;margin-left:-2.4pt;margin-top:-35.2pt;width:605.4pt;height:68.15pt;z-index:251655680;visibility:visible;mso-wrap-style:square;mso-width-percent:0;mso-height-percent:0;mso-wrap-distance-left:9pt;mso-wrap-distance-top:0;mso-wrap-distance-right:9pt;mso-wrap-distance-bottom:0;mso-position-horizontal:absolute;mso-position-horizontal-relative:page;mso-position-vertical:absolute;mso-position-vertical-relative:text;mso-width-percent:0;mso-height-percent:0;mso-width-relative:margin;mso-height-relative:margin;v-text-anchor:middle" o:spid="_x0000_s1026" fillcolor="#04339f" stroked="f" strokeweight="1pt" w14:anchorId="045EC844" o:gfxdata="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">
               <v:shadow on="t" type="perspective" opacity="26214f" offset="0,0" matrix="66847f,,,66847f"/>
@@ -6384,7 +5843,7 @@
 </file>
 
 <file path=word/numbering.xml><?xml version="1.0" encoding="utf-8"?>
-<w:numbering xmlns:wpc="http://schemas.microsoft.com/office/word/2010/wordprocessingCanvas" xmlns:cx="http://schemas.microsoft.com/office/drawing/2014/chartex" xmlns:cx1="http://schemas.microsoft.com/office/drawing/2015/9/8/chartex" xmlns:cx2="http://schemas.microsoft.com/office/drawing/2015/10/21/chartex" xmlns:cx3="http://schemas.microsoft.com/office/drawing/2016/5/9/chartex" xmlns:cx4="http://schemas.microsoft.com/office/drawing/2016/5/10/chartex" xmlns:cx5="http://schemas.microsoft.com/office/drawing/2016/5/11/chartex" xmlns:cx6="http://schemas.microsoft.com/office/drawing/2016/5/12/chartex" xmlns:cx7="http://schemas.microsoft.com/office/drawing/2016/5/13/chartex" xmlns:cx8="http://schemas.microsoft.com/office/drawing/2016/5/14/chartex" xmlns:mc="http://schemas.openxmlformats.org/markup-compatibility/2006" xmlns:aink="http://schemas.microsoft.com/office/drawing/2016/ink" xmlns:am3d="http://schemas.microsoft.com/office/drawing/2017/model3d" xmlns:o="urn:schemas-microsoft-com:office:office" xmlns:oel="http://schemas.microsoft.com/office/2019/extlst" xmlns:r="http://schemas.openxmlformats.org/officeDocument/2006/relationships" xmlns:m="http://schemas.openxmlformats.org/officeDocument/2006/math" xmlns:v="urn:schemas-microsoft-com:vml" xmlns:wp14="http://schemas.microsoft.com/office/word/2010/wordprocessingDrawing" xmlns:wp="http://schemas.openxmlformats.org/drawingml/2006/wordprocessingDrawing" xmlns:w10="urn:schemas-microsoft-com:office:word" xmlns:w="http://schemas.openxmlformats.org/wordprocessingml/2006/main" xmlns:w14="http://schemas.microsoft.com/office/word/2010/wordml" xmlns:w15="http://schemas.microsoft.com/office/word/2012/wordml" xmlns:w16cex="http://schemas.microsoft.com/office/word/2018/wordml/cex" xmlns:w16cid="http://schemas.microsoft.com/office/word/2016/wordml/cid" xmlns:w16="http://schemas.microsoft.com/office/word/2018/wordml" xmlns:w16sdtdh="http://schemas.microsoft.com/office/word/2020/wordml/sdtdatahash" xmlns:w16se="http://schemas.microsoft.com/office/word/2015/wordml/symex" xmlns:wpg="http://schemas.microsoft.com/office/word/2010/wordprocessingGroup" xmlns:wpi="http://schemas.microsoft.com/office/word/2010/wordprocessingInk" xmlns:wne="http://schemas.microsoft.com/office/word/2006/wordml" xmlns:wps="http://schemas.microsoft.com/office/word/2010/wordprocessingShape" mc:Ignorable="w14 w15 w16se w16cid w16 w16cex w16sdtdh wp14">
+<w:numbering xmlns:wpc="http://schemas.microsoft.com/office/word/2010/wordprocessingCanvas" xmlns:cx="http://schemas.microsoft.com/office/drawing/2014/chartex" xmlns:cx1="http://schemas.microsoft.com/office/drawing/2015/9/8/chartex" xmlns:cx2="http://schemas.microsoft.com/office/drawing/2015/10/21/chartex" xmlns:cx3="http://schemas.microsoft.com/office/drawing/2016/5/9/chartex" xmlns:cx4="http://schemas.microsoft.com/office/drawing/2016/5/10/chartex" xmlns:cx5="http://schemas.microsoft.com/office/drawing/2016/5/11/chartex" xmlns:cx6="http://schemas.microsoft.com/office/drawing/2016/5/12/chartex" xmlns:cx7="http://schemas.microsoft.com/office/drawing/2016/5/13/chartex" xmlns:cx8="http://schemas.microsoft.com/office/drawing/2016/5/14/chartex" xmlns:mc="http://schemas.openxmlformats.org/markup-compatibility/2006" xmlns:aink="http://schemas.microsoft.com/office/drawing/2016/ink" xmlns:am3d="http://schemas.microsoft.com/office/drawing/2017/model3d" xmlns:o="urn:schemas-microsoft-com:office:office" xmlns:oel="http://schemas.microsoft.com/office/2019/extlst" xmlns:r="http://schemas.openxmlformats.org/officeDocument/2006/relationships" xmlns:m="http://schemas.openxmlformats.org/officeDocument/2006/math" xmlns:v="urn:schemas-microsoft-com:vml" xmlns:wp14="http://schemas.microsoft.com/office/word/2010/wordprocessingDrawing" xmlns:wp="http://schemas.openxmlformats.org/drawingml/2006/wordprocessingDrawing" xmlns:w10="urn:schemas-microsoft-com:office:word" xmlns:w="http://schemas.openxmlformats.org/wordprocessingml/2006/main" xmlns:w14="http://schemas.microsoft.com/office/word/2010/wordml" xmlns:w15="http://schemas.microsoft.com/office/word/2012/wordml" xmlns:w16cex="http://schemas.microsoft.com/office/word/2018/wordml/cex" xmlns:w16cid="http://schemas.microsoft.com/office/word/2016/wordml/cid" xmlns:w16="http://schemas.microsoft.com/office/word/2018/wordml" xmlns:w16du="http://schemas.microsoft.com/office/word/2023/wordml/word16du" xmlns:w16sdtdh="http://schemas.microsoft.com/office/word/2020/wordml/sdtdatahash" xmlns:w16sdtfl="http://schemas.microsoft.com/office/word/2024/wordml/sdtformatlock" xmlns:w16se="http://schemas.microsoft.com/office/word/2015/wordml/symex" xmlns:wpg="http://schemas.microsoft.com/office/word/2010/wordprocessingGroup" xmlns:wpi="http://schemas.microsoft.com/office/word/2010/wordprocessingInk" xmlns:wne="http://schemas.microsoft.com/office/word/2006/wordml" xmlns:wps="http://schemas.microsoft.com/office/word/2010/wordprocessingShape" mc:Ignorable="w14 w15 w16se w16cid w16 w16cex w16sdtdh w16sdtfl w16du wp14">
   <w:abstractNum w:abstractNumId="0" w15:restartNumberingAfterBreak="0">
     <w:nsid w:val="03B26E4C"/>
     <w:multiLevelType w:val="hybridMultilevel"/>
@@ -10647,7 +10106,7 @@
 </file>
 
 <file path=word/styles.xml><?xml version="1.0" encoding="utf-8"?>
-<w:styles xmlns:mc="http://schemas.openxmlformats.org/markup-compatibility/2006" xmlns:r="http://schemas.openxmlformats.org/officeDocument/2006/relationships" xmlns:w="http://schemas.openxmlformats.org/wordprocessingml/2006/main" xmlns:w14="http://schemas.microsoft.com/office/word/2010/wordml" xmlns:w15="http://schemas.microsoft.com/office/word/2012/wordml" xmlns:w16cex="http://schemas.microsoft.com/office/word/2018/wordml/cex" xmlns:w16cid="http://schemas.microsoft.com/office/word/2016/wordml/cid" xmlns:w16="http://schemas.microsoft.com/office/word/2018/wordml" xmlns:w16sdtdh="http://schemas.microsoft.com/office/word/2020/wordml/sdtdatahash" xmlns:w16se="http://schemas.microsoft.com/office/word/2015/wordml/symex" mc:Ignorable="w14 w15 w16se w16cid w16 w16cex w16sdtdh">
+<w:styles xmlns:mc="http://schemas.openxmlformats.org/markup-compatibility/2006" xmlns:r="http://schemas.openxmlformats.org/officeDocument/2006/relationships" xmlns:w="http://schemas.openxmlformats.org/wordprocessingml/2006/main" xmlns:w14="http://schemas.microsoft.com/office/word/2010/wordml" xmlns:w15="http://schemas.microsoft.com/office/word/2012/wordml" xmlns:w16cex="http://schemas.microsoft.com/office/word/2018/wordml/cex" xmlns:w16cid="http://schemas.microsoft.com/office/word/2016/wordml/cid" xmlns:w16="http://schemas.microsoft.com/office/word/2018/wordml" xmlns:w16du="http://schemas.microsoft.com/office/word/2023/wordml/word16du" xmlns:w16sdtdh="http://schemas.microsoft.com/office/word/2020/wordml/sdtdatahash" xmlns:w16sdtfl="http://schemas.microsoft.com/office/word/2024/wordml/sdtformatlock" xmlns:w16se="http://schemas.microsoft.com/office/word/2015/wordml/symex" mc:Ignorable="w14 w15 w16se w16cid w16 w16cex w16sdtdh w16sdtfl w16du">
   <w:docDefaults>
     <w:rPrDefault>
       <w:rPr>
@@ -11071,7 +10530,6 @@
   <w:style w:type="character" w:default="1" w:styleId="Fuentedeprrafopredeter">
     <w:name w:val="Default Paragraph Font"/>
     <w:uiPriority w:val="1"/>
-    <w:semiHidden/>
     <w:unhideWhenUsed/>
   </w:style>
   <w:style w:type="table" w:default="1" w:styleId="Tablanormal">
@@ -11818,6 +11276,10 @@
 </file>
 
 <file path=customXml/item1.xml><?xml version="1.0" encoding="utf-8"?>
+<b:Sources xmlns:b="http://schemas.openxmlformats.org/officeDocument/2006/bibliography" xmlns="http://schemas.openxmlformats.org/officeDocument/2006/bibliography" SelectedStyle="\APASixthEditionOfficeOnline.xsl" StyleName="APA" Version="6"/>
+</file>
+
+<file path=customXml/item2.xml><?xml version="1.0" encoding="utf-8"?>
 <?mso-contentType ?>
 <FormTemplates xmlns="http://schemas.microsoft.com/sharepoint/v3/contenttype/forms">
   <Display>DocumentLibraryForm</Display>
@@ -11826,11 +11288,18 @@
 </FormTemplates>
 </file>
 
-<file path=customXml/item2.xml><?xml version="1.0" encoding="utf-8"?>
-<b:Sources xmlns:b="http://schemas.openxmlformats.org/officeDocument/2006/bibliography" xmlns="http://schemas.openxmlformats.org/officeDocument/2006/bibliography" SelectedStyle="\APASixthEditionOfficeOnline.xsl" StyleName="APA" Version="6"/>
+<file path=customXml/item3.xml><?xml version="1.0" encoding="utf-8"?>
+<p:properties xmlns:p="http://schemas.microsoft.com/office/2006/metadata/properties" xmlns:xsi="http://www.w3.org/2001/XMLSchema-instance" xmlns:pc="http://schemas.microsoft.com/office/infopath/2007/PartnerControls">
+  <documentManagement>
+    <lcf76f155ced4ddcb4097134ff3c332f xmlns="e89e2614-21ea-4c4c-ba10-359e23a94676">
+      <Terms xmlns="http://schemas.microsoft.com/office/infopath/2007/PartnerControls"/>
+    </lcf76f155ced4ddcb4097134ff3c332f>
+    <TaxCatchAll xmlns="79826464-2836-45bb-a353-b8ea31c76912" xsi:nil="true"/>
+  </documentManagement>
+</p:properties>
 </file>
 
-<file path=customXml/item3.xml><?xml version="1.0" encoding="utf-8"?>
+<file path=customXml/item4.xml><?xml version="1.0" encoding="utf-8"?>
 <ct:contentTypeSchema xmlns:ct="http://schemas.microsoft.com/office/2006/metadata/contentType" xmlns:ma="http://schemas.microsoft.com/office/2006/metadata/properties/metaAttributes" ct:_="" ma:_="" ma:contentTypeName="Documento" ma:contentTypeID="0x010100185D32A349983648ADC3563919C7111C" ma:contentTypeVersion="18" ma:contentTypeDescription="Crear nuevo documento." ma:contentTypeScope="" ma:versionID="883dee97e5bc2cda3b31003f76128277">
   <xsd:schema xmlns:xsd="http://www.w3.org/2001/XMLSchema" xmlns:xs="http://www.w3.org/2001/XMLSchema" xmlns:p="http://schemas.microsoft.com/office/2006/metadata/properties" xmlns:ns2="e89e2614-21ea-4c4c-ba10-359e23a94676" xmlns:ns3="79826464-2836-45bb-a353-b8ea31c76912" targetNamespace="http://schemas.microsoft.com/office/2006/metadata/properties" ma:root="true" ma:fieldsID="1407228447e75c1d65be96b1e3dbfa08" ns2:_="" ns3:_="">
     <xsd:import namespace="e89e2614-21ea-4c4c-ba10-359e23a94676"/>
@@ -12085,18 +11554,15 @@
 </ct:contentTypeSchema>
 </file>
 
-<file path=customXml/item4.xml><?xml version="1.0" encoding="utf-8"?>
-<p:properties xmlns:p="http://schemas.microsoft.com/office/2006/metadata/properties" xmlns:xsi="http://www.w3.org/2001/XMLSchema-instance" xmlns:pc="http://schemas.microsoft.com/office/infopath/2007/PartnerControls">
-  <documentManagement>
-    <lcf76f155ced4ddcb4097134ff3c332f xmlns="e89e2614-21ea-4c4c-ba10-359e23a94676">
-      <Terms xmlns="http://schemas.microsoft.com/office/infopath/2007/PartnerControls"/>
-    </lcf76f155ced4ddcb4097134ff3c332f>
-    <TaxCatchAll xmlns="79826464-2836-45bb-a353-b8ea31c76912" xsi:nil="true"/>
-  </documentManagement>
-</p:properties>
+<file path=customXml/itemProps1.xml><?xml version="1.0" encoding="utf-8"?>
+<ds:datastoreItem xmlns:ds="http://schemas.openxmlformats.org/officeDocument/2006/customXml" ds:itemID="{A7E398C1-8757-354D-97DF-275518C9888A}">
+  <ds:schemaRefs>
+    <ds:schemaRef ds:uri="http://schemas.openxmlformats.org/officeDocument/2006/bibliography"/>
+  </ds:schemaRefs>
+</ds:datastoreItem>
 </file>
 
-<file path=customXml/itemProps1.xml><?xml version="1.0" encoding="utf-8"?>
+<file path=customXml/itemProps2.xml><?xml version="1.0" encoding="utf-8"?>
 <ds:datastoreItem xmlns:ds="http://schemas.openxmlformats.org/officeDocument/2006/customXml" ds:itemID="{AB09A657-C908-4D51-8248-AEAB8FF2CC26}">
   <ds:schemaRefs>
     <ds:schemaRef ds:uri="http://schemas.microsoft.com/sharepoint/v3/contenttype/forms"/>
@@ -12104,15 +11570,18 @@
 </ds:datastoreItem>
 </file>
 
-<file path=customXml/itemProps2.xml><?xml version="1.0" encoding="utf-8"?>
-<ds:datastoreItem xmlns:ds="http://schemas.openxmlformats.org/officeDocument/2006/customXml" ds:itemID="{A7E398C1-8757-354D-97DF-275518C9888A}">
+<file path=customXml/itemProps3.xml><?xml version="1.0" encoding="utf-8"?>
+<ds:datastoreItem xmlns:ds="http://schemas.openxmlformats.org/officeDocument/2006/customXml" ds:itemID="{819D05E4-964A-4027-9D41-12E144FD2B4D}">
   <ds:schemaRefs>
-    <ds:schemaRef ds:uri="http://schemas.openxmlformats.org/officeDocument/2006/bibliography"/>
+    <ds:schemaRef ds:uri="http://schemas.microsoft.com/office/2006/metadata/properties"/>
+    <ds:schemaRef ds:uri="http://schemas.microsoft.com/office/infopath/2007/PartnerControls"/>
+    <ds:schemaRef ds:uri="e89e2614-21ea-4c4c-ba10-359e23a94676"/>
+    <ds:schemaRef ds:uri="79826464-2836-45bb-a353-b8ea31c76912"/>
   </ds:schemaRefs>
 </ds:datastoreItem>
 </file>
 
-<file path=customXml/itemProps3.xml><?xml version="1.0" encoding="utf-8"?>
+<file path=customXml/itemProps4.xml><?xml version="1.0" encoding="utf-8"?>
 <ds:datastoreItem xmlns:ds="http://schemas.openxmlformats.org/officeDocument/2006/customXml" ds:itemID="{FD34828C-A533-4E4B-AAAC-1C709D4FAC9C}">
   <ds:schemaRefs>
     <ds:schemaRef ds:uri="http://schemas.microsoft.com/office/2006/metadata/contentType"/>
@@ -12129,15 +11598,4 @@
     <ds:schemaRef ds:uri="http://schemas.microsoft.com/internal/obd"/>
   </ds:schemaRefs>
 </ds:datastoreItem>
-</file>
-
-<file path=customXml/itemProps4.xml><?xml version="1.0" encoding="utf-8"?>
-<ds:datastoreItem xmlns:ds="http://schemas.openxmlformats.org/officeDocument/2006/customXml" ds:itemID="{819D05E4-964A-4027-9D41-12E144FD2B4D}">
-  <ds:schemaRefs>
-    <ds:schemaRef ds:uri="http://schemas.microsoft.com/office/2006/metadata/properties"/>
-    <ds:schemaRef ds:uri="http://schemas.microsoft.com/office/infopath/2007/PartnerControls"/>
-    <ds:schemaRef ds:uri="e89e2614-21ea-4c4c-ba10-359e23a94676"/>
-    <ds:schemaRef ds:uri="79826464-2836-45bb-a353-b8ea31c76912"/>
-  </ds:schemaRefs>
-</ds:datastoreItem>
 </file>
</xml_diff>

<commit_message>
Completar tabla de servicios en el Word grupal
</commit_message>
<xml_diff>
--- a/GRUPO 5 RBD Entrega Parcial 2627.docx
+++ b/GRUPO 5 RBD Entrega Parcial 2627.docx
@@ -490,7 +490,7 @@
               </wp:anchor>
             </w:drawing>
           </mc:Choice>
-          <mc:Fallback xmlns:pic="http://schemas.openxmlformats.org/drawingml/2006/picture" xmlns:a14="http://schemas.microsoft.com/office/drawing/2010/main" xmlns:a="http://schemas.openxmlformats.org/drawingml/2006/main">
+          <mc:Fallback xmlns:a="http://schemas.openxmlformats.org/drawingml/2006/main" xmlns:a14="http://schemas.microsoft.com/office/drawing/2010/main" xmlns:pic="http://schemas.openxmlformats.org/drawingml/2006/picture">
             <w:pict>
               <v:shapetype id="_x0000_t202" coordsize="21600,21600" o:spt="202" path="m,l,21600r21600,l21600,xe" w14:anchorId="05415908">
                 <v:stroke joinstyle="miter"/>
@@ -642,7 +642,7 @@
               </wp:anchor>
             </w:drawing>
           </mc:Choice>
-          <mc:Fallback xmlns:a="http://schemas.openxmlformats.org/drawingml/2006/main" xmlns:a14="http://schemas.microsoft.com/office/drawing/2010/main" xmlns:pic="http://schemas.openxmlformats.org/drawingml/2006/picture" xmlns:mo="http://schemas.microsoft.com/office/mac/office/2008/main" xmlns:mv="urn:schemas-microsoft-com:mac:vml">
+          <mc:Fallback xmlns:mv="urn:schemas-microsoft-com:mac:vml" xmlns:mo="http://schemas.microsoft.com/office/mac/office/2008/main" xmlns:pic="http://schemas.openxmlformats.org/drawingml/2006/picture" xmlns:a14="http://schemas.microsoft.com/office/drawing/2010/main" xmlns:a="http://schemas.openxmlformats.org/drawingml/2006/main">
             <w:pict>
               <v:rect id="Rectángulo 194" style="position:absolute;margin-left:-46.95pt;margin-top:-39.85pt;width:524.3pt;height:115.05pt;z-index:251659264;visibility:visible;mso-wrap-style:square;mso-width-percent:0;mso-height-percent:0;mso-wrap-distance-left:9pt;mso-wrap-distance-top:0;mso-wrap-distance-right:9pt;mso-wrap-distance-bottom:0;mso-position-horizontal:absolute;mso-position-horizontal-relative:text;mso-position-vertical:absolute;mso-position-vertical-relative:text;mso-width-percent:0;mso-height-percent:0;mso-width-relative:page;mso-height-relative:page;v-text-anchor:middle" o:spid="_x0000_s1026" fillcolor="#04339f" stroked="f" strokeweight="1pt" w14:anchorId="060E793F" o:gfxdata="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">
                 <w10:wrap type="tight"/>
@@ -2106,35 +2106,7 @@
                 <w:rFonts w:ascii="Roboto Light" w:hAnsi="Roboto Light"/>
                 <w:lang w:val="es-ES"/>
               </w:rPr>
-              <w:t>Servicio básico de</w:t>
-            </w:r>
-            <w:r>
-              <w:rPr>
-                <w:rFonts w:ascii="Roboto Light" w:hAnsi="Roboto Light"/>
-                <w:lang w:val="es-ES"/>
-              </w:rPr>
-              <w:t xml:space="preserve"> la nube </w:t>
-            </w:r>
-            <w:r>
-              <w:rPr>
-                <w:rFonts w:ascii="Roboto Light" w:hAnsi="Roboto Light"/>
-                <w:lang w:val="es-ES"/>
-              </w:rPr>
-              <w:t xml:space="preserve">AWS. En EC2 se crean las máquinas virtuales en la nube. Permite su creación de forma rápida. </w:t>
-            </w:r>
-            <w:r>
-              <w:rPr>
-                <w:rFonts w:ascii="Roboto Light" w:hAnsi="Roboto Light"/>
-                <w:lang w:val="es-ES"/>
-              </w:rPr>
-              <w:t>Además,</w:t>
-            </w:r>
-            <w:r>
-              <w:rPr>
-                <w:rFonts w:ascii="Roboto Light" w:hAnsi="Roboto Light"/>
-                <w:lang w:val="es-ES"/>
-              </w:rPr>
-              <w:t xml:space="preserve"> si la máquina virtual se queda corta, se puede reescalar añadiendo más potencia fácilmente.</w:t>
+              <w:t>Servicio básico de la nube AWS. En EC2 se crean las máquinas virtuales en la nube. Permite su creación de forma rápida. Además, si la máquina virtual se queda corta, se puede reescalar añadiendo más potencia fácilmente.</w:t>
             </w:r>
           </w:p>
         </w:tc>
@@ -2183,6 +2155,13 @@
                 <w:lang w:val="es-ES"/>
               </w:rPr>
             </w:pPr>
+            <w:r>
+              <w:rPr>
+                <w:rFonts w:ascii="Roboto Light" w:hAnsi="Roboto Light"/>
+                <w:lang w:val="es-ES"/>
+              </w:rPr>
+              <w:t>Servicio de AWS relacionado con BBDD o motor de base de datos relacional de AWS, en lugar de disponer de este servicio on premise sobre un servidor, es alojado en el Cloud de AWS, un ejemplo puede ser Postgresql</w:t>
+            </w:r>
           </w:p>
         </w:tc>
       </w:tr>
@@ -2230,6 +2209,13 @@
                 <w:lang w:val="es-ES"/>
               </w:rPr>
             </w:pPr>
+            <w:r>
+              <w:rPr>
+                <w:rFonts w:ascii="Roboto Light" w:hAnsi="Roboto Light"/>
+                <w:lang w:val="es-ES"/>
+              </w:rPr>
+              <w:t>Almacenamiento de AWS alojado en Cloud, útil para llegar a los datos desde distintos servicios de AWS, por ejemplo: Una página expuesta en Cloudfront de AWS, el usuario accede a esa web y tras hacer login quiere consultar una información, esta información está alojada en un Bucket de S3. Backups de un servidor sql server alojados en una instancia ec2, requieres que se sincronicen en S3 para mantener información redundada.</w:t>
+            </w:r>
           </w:p>
         </w:tc>
       </w:tr>
@@ -2271,12 +2257,18 @@
                 <w:ilvl w:val="0"/>
                 <w:numId w:val="0"/>
               </w:numPr>
-              <w:jc w:val="center"/>
               <w:rPr>
                 <w:rFonts w:ascii="Roboto Light" w:hAnsi="Roboto Light"/>
                 <w:lang w:val="es-ES"/>
               </w:rPr>
             </w:pPr>
+            <w:r>
+              <w:rPr>
+                <w:rFonts w:ascii="Roboto Light" w:hAnsi="Roboto Light"/>
+                <w:lang w:val="es-ES"/>
+              </w:rPr>
+              <w:t>Servicio de almacenamiento de AWS, más enfocado u orientado a la instancia EC2, a modo de unidad de red o volumen, lo definiría como un disco duro conectado a la instancia ec2</w:t>
+            </w:r>
           </w:p>
         </w:tc>
       </w:tr>
@@ -2318,12 +2310,18 @@
                 <w:ilvl w:val="0"/>
                 <w:numId w:val="0"/>
               </w:numPr>
-              <w:jc w:val="center"/>
               <w:rPr>
                 <w:rFonts w:ascii="Roboto Light" w:hAnsi="Roboto Light"/>
                 <w:lang w:val="es-ES"/>
               </w:rPr>
             </w:pPr>
+            <w:r>
+              <w:rPr>
+                <w:rFonts w:ascii="Roboto Light" w:hAnsi="Roboto Light"/>
+                <w:lang w:val="es-ES"/>
+              </w:rPr>
+              <w:t>Tipo de BBDD de AWS, junto con Aurora son servicios de BBDD de AWS, en este caso DynamoDB no es BBD relacional. En el caso de Aurosa si es relacional.</w:t>
+            </w:r>
           </w:p>
         </w:tc>
       </w:tr>
@@ -2372,12 +2370,18 @@
                 <w:ilvl w:val="0"/>
                 <w:numId w:val="0"/>
               </w:numPr>
-              <w:jc w:val="center"/>
               <w:rPr>
                 <w:rFonts w:ascii="Roboto Light" w:hAnsi="Roboto Light"/>
                 <w:lang w:val="es-ES"/>
               </w:rPr>
             </w:pPr>
+            <w:r>
+              <w:rPr>
+                <w:rFonts w:ascii="Roboto Light" w:hAnsi="Roboto Light"/>
+                <w:lang w:val="es-ES"/>
+              </w:rPr>
+              <w:t>Servicio de AWS muy orientado a programación web, sirve para copiar el contenido de la web en distintos servidores por distintas ubicaciones, es muy rápido y muy seguro, dentro de la arquitectura de AWS podrías definir páginas Web así como exponerlas al exterior, pueden ser protegidas por el propio WAF de AWS</w:t>
+            </w:r>
           </w:p>
         </w:tc>
       </w:tr>
@@ -2419,7 +2423,26 @@
                 <w:ilvl w:val="0"/>
                 <w:numId w:val="0"/>
               </w:numPr>
-              <w:jc w:val="center"/>
+              <w:rPr>
+                <w:rFonts w:ascii="Roboto Light" w:hAnsi="Roboto Light"/>
+                <w:lang w:val="es-ES"/>
+              </w:rPr>
+            </w:pPr>
+            <w:r>
+              <w:rPr>
+                <w:rFonts w:ascii="Roboto Light" w:hAnsi="Roboto Light"/>
+                <w:lang w:val="es-ES"/>
+              </w:rPr>
+              <w:t>Servicio de AWS para la gestión de Kubernetes, en este punto tengo dudas entre Docker y Kubernetes, desde el punto de vista de AWS, EKS sería el servicio que ayuda a administrar los Kubernetes.</w:t>
+            </w:r>
+          </w:p>
+          <w:p>
+            <w:pPr>
+              <w:pStyle w:val="Listaconvietas"/>
+              <w:numPr>
+                <w:ilvl w:val="0"/>
+                <w:numId w:val="0"/>
+              </w:numPr>
               <w:rPr>
                 <w:rFonts w:ascii="Roboto Light" w:hAnsi="Roboto Light"/>
                 <w:lang w:val="es-ES"/>
@@ -2451,6 +2474,7 @@
                 <w:rFonts w:ascii="Roboto Light" w:hAnsi="Roboto Light"/>
                 <w:lang w:val="es-ES"/>
               </w:rPr>
+              <w:lastRenderedPageBreak/>
               <w:t>AWS Lambda</w:t>
             </w:r>
           </w:p>
@@ -2466,12 +2490,18 @@
                 <w:ilvl w:val="0"/>
                 <w:numId w:val="0"/>
               </w:numPr>
-              <w:jc w:val="center"/>
               <w:rPr>
                 <w:rFonts w:ascii="Roboto Light" w:hAnsi="Roboto Light"/>
                 <w:lang w:val="es-ES"/>
               </w:rPr>
             </w:pPr>
+            <w:r>
+              <w:rPr>
+                <w:rFonts w:ascii="Roboto Light" w:hAnsi="Roboto Light"/>
+                <w:lang w:val="es-ES"/>
+              </w:rPr>
+              <w:t>Servicio de AWS que compararía con un demonio dormido, un desencadenante en Cloudfront permitiría a este servicio despertar y ejecutar el código que se le hubiese subido. La gracia de este tipo de servicios es que se paga por uso, mientras el servicio esté parado no está facturando.</w:t>
+            </w:r>
           </w:p>
         </w:tc>
       </w:tr>
@@ -2502,7 +2532,7 @@
                 <w:iCs/>
                 <w:lang w:val="es-ES"/>
               </w:rPr>
-              <w:t>Servicio añadido 1</w:t>
+              <w:t>Amazon Q</w:t>
             </w:r>
           </w:p>
         </w:tc>
@@ -2517,12 +2547,18 @@
                 <w:ilvl w:val="0"/>
                 <w:numId w:val="0"/>
               </w:numPr>
-              <w:jc w:val="center"/>
               <w:rPr>
                 <w:rFonts w:ascii="Roboto Light" w:hAnsi="Roboto Light"/>
                 <w:lang w:val="es-ES"/>
               </w:rPr>
             </w:pPr>
+            <w:r>
+              <w:rPr>
+                <w:rFonts w:ascii="Roboto Light" w:hAnsi="Roboto Light"/>
+                <w:lang w:val="es-ES"/>
+              </w:rPr>
+              <w:t>La IA de Amazon o un asistente de IA de Amazon instalable en Visual Studio Code, muy útil para ayudar a depurar o investigar código en distintos lenguajes, por ejemplo muy útil para combinar html CSS y Phyton con Java Script</w:t>
+            </w:r>
           </w:p>
         </w:tc>
       </w:tr>
@@ -2553,7 +2589,7 @@
                 <w:iCs/>
                 <w:lang w:val="es-ES"/>
               </w:rPr>
-              <w:t>Servicio añadido 2</w:t>
+              <w:t>Cloudwatch</w:t>
             </w:r>
           </w:p>
         </w:tc>
@@ -2568,12 +2604,18 @@
                 <w:ilvl w:val="0"/>
                 <w:numId w:val="0"/>
               </w:numPr>
-              <w:jc w:val="center"/>
               <w:rPr>
                 <w:rFonts w:ascii="Roboto Light" w:hAnsi="Roboto Light"/>
                 <w:lang w:val="es-ES"/>
               </w:rPr>
             </w:pPr>
+            <w:r>
+              <w:rPr>
+                <w:rFonts w:ascii="Roboto Light" w:hAnsi="Roboto Light"/>
+                <w:lang w:val="es-ES"/>
+              </w:rPr>
+              <w:t>Algo similar a un monitor de eventos o servicio de monitorización de eventos de Amazon, mucho más elaborado que un Nagios y más vistoso, ayuda a gestionar alertas de los distintos servicios alojados en las distintas VPC.</w:t>
+            </w:r>
           </w:p>
         </w:tc>
       </w:tr>
@@ -2604,7 +2646,7 @@
                 <w:iCs/>
                 <w:lang w:val="es-ES"/>
               </w:rPr>
-              <w:t>Servicio añadido 3</w:t>
+              <w:t>Cognito</w:t>
             </w:r>
           </w:p>
         </w:tc>
@@ -2619,12 +2661,18 @@
                 <w:ilvl w:val="0"/>
                 <w:numId w:val="0"/>
               </w:numPr>
-              <w:jc w:val="center"/>
               <w:rPr>
                 <w:rFonts w:ascii="Roboto Light" w:hAnsi="Roboto Light"/>
                 <w:lang w:val="es-ES"/>
               </w:rPr>
             </w:pPr>
+            <w:r>
+              <w:rPr>
+                <w:rFonts w:ascii="Roboto Light" w:hAnsi="Roboto Light"/>
+                <w:lang w:val="es-ES"/>
+              </w:rPr>
+              <w:t>Gestión de identidades de usuarios para aplicaciones, ejemplo, app web publicada al exterior que requiere registro de usuarios, contraseñas y MFA, cognito sería la solución a esta necesidad, sería la herramienta que ayuda a validar a los usuarios.</w:t>
+            </w:r>
           </w:p>
         </w:tc>
       </w:tr>
@@ -5415,7 +5463,7 @@
             </wp:anchor>
           </w:drawing>
         </mc:Choice>
-        <mc:Fallback xmlns:a="http://schemas.openxmlformats.org/drawingml/2006/main" xmlns:mo="http://schemas.microsoft.com/office/mac/office/2008/main" xmlns:mv="urn:schemas-microsoft-com:mac:vml">
+        <mc:Fallback xmlns:mv="urn:schemas-microsoft-com:mac:vml" xmlns:mo="http://schemas.microsoft.com/office/mac/office/2008/main" xmlns:a="http://schemas.openxmlformats.org/drawingml/2006/main">
           <w:pict>
             <v:rect id="Rectangle 13" style="position:absolute;margin-left:-12pt;margin-top:-1.45pt;width:607.8pt;height:49.65pt;z-index:251658752;visibility:visible;mso-wrap-style:square;mso-width-percent:0;mso-height-percent:0;mso-wrap-distance-left:9pt;mso-wrap-distance-top:0;mso-wrap-distance-right:9pt;mso-wrap-distance-bottom:0;mso-position-horizontal:absolute;mso-position-horizontal-relative:page;mso-position-vertical:absolute;mso-position-vertical-relative:text;mso-width-percent:0;mso-height-percent:0;mso-width-relative:margin;mso-height-relative:margin;v-text-anchor:middle" o:spid="_x0000_s1026" fillcolor="#04339f" stroked="f" strokeweight="1pt" w14:anchorId="4E87756A" o:gfxdata="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">
               <v:shadow on="t" type="perspective" opacity="26214f" offset="0,0" matrix="66847f,,,66847f"/>
@@ -5827,7 +5875,7 @@
             </wp:anchor>
           </w:drawing>
         </mc:Choice>
-        <mc:Fallback xmlns:a="http://schemas.openxmlformats.org/drawingml/2006/main" xmlns:pic="http://schemas.openxmlformats.org/drawingml/2006/picture" xmlns:a14="http://schemas.microsoft.com/office/drawing/2010/main" xmlns:mo="http://schemas.microsoft.com/office/mac/office/2008/main" xmlns:mv="urn:schemas-microsoft-com:mac:vml">
+        <mc:Fallback xmlns:mv="urn:schemas-microsoft-com:mac:vml" xmlns:mo="http://schemas.microsoft.com/office/mac/office/2008/main" xmlns:a14="http://schemas.microsoft.com/office/drawing/2010/main" xmlns:pic="http://schemas.openxmlformats.org/drawingml/2006/picture" xmlns:a="http://schemas.openxmlformats.org/drawingml/2006/main">
           <w:pict>
             <v:rect id="Rectangle 1" style="position:absolute;margin-left:-2.4pt;margin-top:-35.2pt;width:605.4pt;height:68.15pt;z-index:251655680;visibility:visible;mso-wrap-style:square;mso-width-percent:0;mso-height-percent:0;mso-wrap-distance-left:9pt;mso-wrap-distance-top:0;mso-wrap-distance-right:9pt;mso-wrap-distance-bottom:0;mso-position-horizontal:absolute;mso-position-horizontal-relative:page;mso-position-vertical:absolute;mso-position-vertical-relative:text;mso-width-percent:0;mso-height-percent:0;mso-width-relative:margin;mso-height-relative:margin;v-text-anchor:middle" o:spid="_x0000_s1026" fillcolor="#04339f" stroked="f" strokeweight="1pt" w14:anchorId="045EC844" o:gfxdata="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">
               <v:shadow on="t" type="perspective" opacity="26214f" offset="0,0" matrix="66847f,,,66847f"/>
@@ -11276,10 +11324,6 @@
 </file>
 
 <file path=customXml/item1.xml><?xml version="1.0" encoding="utf-8"?>
-<b:Sources xmlns:b="http://schemas.openxmlformats.org/officeDocument/2006/bibliography" xmlns="http://schemas.openxmlformats.org/officeDocument/2006/bibliography" SelectedStyle="\APASixthEditionOfficeOnline.xsl" StyleName="APA" Version="6"/>
-</file>
-
-<file path=customXml/item2.xml><?xml version="1.0" encoding="utf-8"?>
 <?mso-contentType ?>
 <FormTemplates xmlns="http://schemas.microsoft.com/sharepoint/v3/contenttype/forms">
   <Display>DocumentLibraryForm</Display>
@@ -11288,18 +11332,11 @@
 </FormTemplates>
 </file>
 
-<file path=customXml/item3.xml><?xml version="1.0" encoding="utf-8"?>
-<p:properties xmlns:p="http://schemas.microsoft.com/office/2006/metadata/properties" xmlns:xsi="http://www.w3.org/2001/XMLSchema-instance" xmlns:pc="http://schemas.microsoft.com/office/infopath/2007/PartnerControls">
-  <documentManagement>
-    <lcf76f155ced4ddcb4097134ff3c332f xmlns="e89e2614-21ea-4c4c-ba10-359e23a94676">
-      <Terms xmlns="http://schemas.microsoft.com/office/infopath/2007/PartnerControls"/>
-    </lcf76f155ced4ddcb4097134ff3c332f>
-    <TaxCatchAll xmlns="79826464-2836-45bb-a353-b8ea31c76912" xsi:nil="true"/>
-  </documentManagement>
-</p:properties>
+<file path=customXml/item2.xml><?xml version="1.0" encoding="utf-8"?>
+<b:Sources xmlns:b="http://schemas.openxmlformats.org/officeDocument/2006/bibliography" xmlns="http://schemas.openxmlformats.org/officeDocument/2006/bibliography" SelectedStyle="\APASixthEditionOfficeOnline.xsl" StyleName="APA" Version="6"/>
 </file>
 
-<file path=customXml/item4.xml><?xml version="1.0" encoding="utf-8"?>
+<file path=customXml/item3.xml><?xml version="1.0" encoding="utf-8"?>
 <ct:contentTypeSchema xmlns:ct="http://schemas.microsoft.com/office/2006/metadata/contentType" xmlns:ma="http://schemas.microsoft.com/office/2006/metadata/properties/metaAttributes" ct:_="" ma:_="" ma:contentTypeName="Documento" ma:contentTypeID="0x010100185D32A349983648ADC3563919C7111C" ma:contentTypeVersion="18" ma:contentTypeDescription="Crear nuevo documento." ma:contentTypeScope="" ma:versionID="883dee97e5bc2cda3b31003f76128277">
   <xsd:schema xmlns:xsd="http://www.w3.org/2001/XMLSchema" xmlns:xs="http://www.w3.org/2001/XMLSchema" xmlns:p="http://schemas.microsoft.com/office/2006/metadata/properties" xmlns:ns2="e89e2614-21ea-4c4c-ba10-359e23a94676" xmlns:ns3="79826464-2836-45bb-a353-b8ea31c76912" targetNamespace="http://schemas.microsoft.com/office/2006/metadata/properties" ma:root="true" ma:fieldsID="1407228447e75c1d65be96b1e3dbfa08" ns2:_="" ns3:_="">
     <xsd:import namespace="e89e2614-21ea-4c4c-ba10-359e23a94676"/>
@@ -11554,7 +11591,26 @@
 </ct:contentTypeSchema>
 </file>
 
+<file path=customXml/item4.xml><?xml version="1.0" encoding="utf-8"?>
+<p:properties xmlns:p="http://schemas.microsoft.com/office/2006/metadata/properties" xmlns:xsi="http://www.w3.org/2001/XMLSchema-instance" xmlns:pc="http://schemas.microsoft.com/office/infopath/2007/PartnerControls">
+  <documentManagement>
+    <lcf76f155ced4ddcb4097134ff3c332f xmlns="e89e2614-21ea-4c4c-ba10-359e23a94676">
+      <Terms xmlns="http://schemas.microsoft.com/office/infopath/2007/PartnerControls"/>
+    </lcf76f155ced4ddcb4097134ff3c332f>
+    <TaxCatchAll xmlns="79826464-2836-45bb-a353-b8ea31c76912" xsi:nil="true"/>
+  </documentManagement>
+</p:properties>
+</file>
+
 <file path=customXml/itemProps1.xml><?xml version="1.0" encoding="utf-8"?>
+<ds:datastoreItem xmlns:ds="http://schemas.openxmlformats.org/officeDocument/2006/customXml" ds:itemID="{AB09A657-C908-4D51-8248-AEAB8FF2CC26}">
+  <ds:schemaRefs>
+    <ds:schemaRef ds:uri="http://schemas.microsoft.com/sharepoint/v3/contenttype/forms"/>
+  </ds:schemaRefs>
+</ds:datastoreItem>
+</file>
+
+<file path=customXml/itemProps2.xml><?xml version="1.0" encoding="utf-8"?>
 <ds:datastoreItem xmlns:ds="http://schemas.openxmlformats.org/officeDocument/2006/customXml" ds:itemID="{A7E398C1-8757-354D-97DF-275518C9888A}">
   <ds:schemaRefs>
     <ds:schemaRef ds:uri="http://schemas.openxmlformats.org/officeDocument/2006/bibliography"/>
@@ -11562,26 +11618,7 @@
 </ds:datastoreItem>
 </file>
 
-<file path=customXml/itemProps2.xml><?xml version="1.0" encoding="utf-8"?>
-<ds:datastoreItem xmlns:ds="http://schemas.openxmlformats.org/officeDocument/2006/customXml" ds:itemID="{AB09A657-C908-4D51-8248-AEAB8FF2CC26}">
-  <ds:schemaRefs>
-    <ds:schemaRef ds:uri="http://schemas.microsoft.com/sharepoint/v3/contenttype/forms"/>
-  </ds:schemaRefs>
-</ds:datastoreItem>
-</file>
-
 <file path=customXml/itemProps3.xml><?xml version="1.0" encoding="utf-8"?>
-<ds:datastoreItem xmlns:ds="http://schemas.openxmlformats.org/officeDocument/2006/customXml" ds:itemID="{819D05E4-964A-4027-9D41-12E144FD2B4D}">
-  <ds:schemaRefs>
-    <ds:schemaRef ds:uri="http://schemas.microsoft.com/office/2006/metadata/properties"/>
-    <ds:schemaRef ds:uri="http://schemas.microsoft.com/office/infopath/2007/PartnerControls"/>
-    <ds:schemaRef ds:uri="e89e2614-21ea-4c4c-ba10-359e23a94676"/>
-    <ds:schemaRef ds:uri="79826464-2836-45bb-a353-b8ea31c76912"/>
-  </ds:schemaRefs>
-</ds:datastoreItem>
-</file>
-
-<file path=customXml/itemProps4.xml><?xml version="1.0" encoding="utf-8"?>
 <ds:datastoreItem xmlns:ds="http://schemas.openxmlformats.org/officeDocument/2006/customXml" ds:itemID="{FD34828C-A533-4E4B-AAAC-1C709D4FAC9C}">
   <ds:schemaRefs>
     <ds:schemaRef ds:uri="http://schemas.microsoft.com/office/2006/metadata/contentType"/>
@@ -11598,4 +11635,15 @@
     <ds:schemaRef ds:uri="http://schemas.microsoft.com/internal/obd"/>
   </ds:schemaRefs>
 </ds:datastoreItem>
+</file>
+
+<file path=customXml/itemProps4.xml><?xml version="1.0" encoding="utf-8"?>
+<ds:datastoreItem xmlns:ds="http://schemas.openxmlformats.org/officeDocument/2006/customXml" ds:itemID="{819D05E4-964A-4027-9D41-12E144FD2B4D}">
+  <ds:schemaRefs>
+    <ds:schemaRef ds:uri="http://schemas.microsoft.com/office/2006/metadata/properties"/>
+    <ds:schemaRef ds:uri="http://schemas.microsoft.com/office/infopath/2007/PartnerControls"/>
+    <ds:schemaRef ds:uri="e89e2614-21ea-4c4c-ba10-359e23a94676"/>
+    <ds:schemaRef ds:uri="79826464-2836-45bb-a353-b8ea31c76912"/>
+  </ds:schemaRefs>
+</ds:datastoreItem>
 </file>
</xml_diff>